<commit_message>
Final report, README, screenshots and video walkthrough
</commit_message>
<xml_diff>
--- a/docs/MLOps_Assignment1_Report.docx
+++ b/docs/MLOps_Assignment1_Report.docx
@@ -4,7 +4,7 @@
   <w:body>
     <w:p>
       <w:pPr>
-        <w:spacing w:after="200" w:before="2200"/>
+        <w:spacing w:after="200" w:before="1200"/>
         <w:jc w:val="center"/>
       </w:pPr>
       <w:r>
@@ -35,7 +35,7 @@
     </w:p>
     <w:p>
       <w:pPr>
-        <w:spacing w:after="1200"/>
+        <w:spacing w:after="700"/>
         <w:jc w:val="center"/>
       </w:pPr>
       <w:r>
@@ -69,7 +69,7 @@
           <w:sz w:val="24"/>
           <w:szCs w:val="24"/>
         </w:rPr>
-        <w:t xml:space="preserve">[Your full name]</w:t>
+        <w:t xml:space="preserve">VIPIN VK</w:t>
       </w:r>
     </w:p>
     <w:p>
@@ -93,7 +93,7 @@
           <w:sz w:val="24"/>
           <w:szCs w:val="24"/>
         </w:rPr>
-        <w:t xml:space="preserve">[Your BITS ID]</w:t>
+        <w:t xml:space="preserve">2025ae05835</w:t>
       </w:r>
     </w:p>
     <w:p>
@@ -117,7 +117,7 @@
           <w:sz w:val="24"/>
           <w:szCs w:val="24"/>
         </w:rPr>
-        <w:t xml:space="preserve">https://github.com/&lt;your-user&gt;/heart-mlops</w:t>
+        <w:t xml:space="preserve">https://github.com/2025ae05835/heart-mlops</w:t>
       </w:r>
     </w:p>
     <w:p>
@@ -141,7 +141,7 @@
           <w:sz w:val="24"/>
           <w:szCs w:val="24"/>
         </w:rPr>
-        <w:t xml:space="preserve">See Section 8</w:t>
+        <w:t xml:space="preserve">Local Kubernetes (Minikube), not public: POST http://&lt;EXTERNAL-IP&gt;/predict after scripts/deploy_k8s.sh and minikube tunnel (Section 8, README section 5)</w:t>
       </w:r>
     </w:p>
     <w:p>
@@ -165,7 +165,7 @@
           <w:sz w:val="24"/>
           <w:szCs w:val="24"/>
         </w:rPr>
-        <w:t xml:space="preserve">[link to recording]</w:t>
+        <w:t xml:space="preserve">video/2025ae05835.mp4 in the repository</w:t>
       </w:r>
     </w:p>
     <w:p>
@@ -193,51 +193,173 @@
       </w:r>
     </w:p>
     <w:p>
-      <w:r>
-        <w:br w:type="page"/>
-      </w:r>
-    </w:p>
-    <w:p>
-      <w:pPr>
-        <w:pStyle w:val="Heading1"/>
-      </w:pPr>
-      <w:r>
+      <w:pPr>
+        <w:spacing w:after="120" w:before="500"/>
+      </w:pPr>
+      <w:r>
+        <w:rPr>
+          <w:rFonts w:ascii="Calibri" w:cs="Calibri" w:eastAsia="Calibri" w:hAnsi="Calibri"/>
+          <w:b/>
+          <w:bCs/>
+          <w:color w:val="1F3A5F"/>
+          <w:sz w:val="26"/>
+          <w:szCs w:val="26"/>
+        </w:rPr>
         <w:t xml:space="preserve">Contents</w:t>
       </w:r>
     </w:p>
-    <w:sdt>
-      <w:sdtPr>
-        <w:alias w:val="Contents"/>
-      </w:sdtPr>
-      <w:sdtContent>
-        <w:p>
-          <w:r>
-            <w:fldChar w:fldCharType="begin" w:dirty="true"/>
-            <w:instrText xml:space="preserve">TOC \h \o "1-2"</w:instrText>
-            <w:fldChar w:fldCharType="separate"/>
-          </w:r>
-        </w:p>
-        <w:p>
-          <w:r>
-            <w:fldChar w:fldCharType="end"/>
-          </w:r>
-        </w:p>
-      </w:sdtContent>
-    </w:sdt>
-    <w:p>
-      <w:pPr>
-        <w:spacing w:after="120" w:line="276"/>
-      </w:pPr>
-      <w:r>
-        <w:rPr>
-          <w:rFonts w:ascii="Calibri" w:cs="Calibri" w:eastAsia="Calibri" w:hAnsi="Calibri"/>
-          <w:i/>
-          <w:iCs/>
-          <w:color w:val="777777"/>
-          <w:sz w:val="18"/>
-          <w:szCs w:val="18"/>
-        </w:rPr>
-        <w:t xml:space="preserve">Right-click the table above → Update Field to refresh page numbers after inserting screenshots.</w:t>
+    <w:p>
+      <w:pPr>
+        <w:spacing w:after="40"/>
+        <w:ind w:left="360"/>
+      </w:pPr>
+      <w:r>
+        <w:rPr>
+          <w:rFonts w:ascii="Calibri" w:cs="Calibri" w:eastAsia="Calibri" w:hAnsi="Calibri"/>
+          <w:sz w:val="21"/>
+          <w:szCs w:val="21"/>
+        </w:rPr>
+        <w:t xml:space="preserve">1. Overview and architecture</w:t>
+      </w:r>
+    </w:p>
+    <w:p>
+      <w:pPr>
+        <w:spacing w:after="40"/>
+        <w:ind w:left="360"/>
+      </w:pPr>
+      <w:r>
+        <w:rPr>
+          <w:rFonts w:ascii="Calibri" w:cs="Calibri" w:eastAsia="Calibri" w:hAnsi="Calibri"/>
+          <w:sz w:val="21"/>
+          <w:szCs w:val="21"/>
+        </w:rPr>
+        <w:t xml:space="preserve">2. Setup and installation</w:t>
+      </w:r>
+    </w:p>
+    <w:p>
+      <w:pPr>
+        <w:spacing w:after="40"/>
+        <w:ind w:left="360"/>
+      </w:pPr>
+      <w:r>
+        <w:rPr>
+          <w:rFonts w:ascii="Calibri" w:cs="Calibri" w:eastAsia="Calibri" w:hAnsi="Calibri"/>
+          <w:sz w:val="21"/>
+          <w:szCs w:val="21"/>
+        </w:rPr>
+        <w:t xml:space="preserve">3. Data acquisition and cleaning</w:t>
+      </w:r>
+    </w:p>
+    <w:p>
+      <w:pPr>
+        <w:spacing w:after="40"/>
+        <w:ind w:left="360"/>
+      </w:pPr>
+      <w:r>
+        <w:rPr>
+          <w:rFonts w:ascii="Calibri" w:cs="Calibri" w:eastAsia="Calibri" w:hAnsi="Calibri"/>
+          <w:sz w:val="21"/>
+          <w:szCs w:val="21"/>
+        </w:rPr>
+        <w:t xml:space="preserve">4. Exploratory data analysis</w:t>
+      </w:r>
+    </w:p>
+    <w:p>
+      <w:pPr>
+        <w:spacing w:after="40"/>
+        <w:ind w:left="360"/>
+      </w:pPr>
+      <w:r>
+        <w:rPr>
+          <w:rFonts w:ascii="Calibri" w:cs="Calibri" w:eastAsia="Calibri" w:hAnsi="Calibri"/>
+          <w:sz w:val="21"/>
+          <w:szCs w:val="21"/>
+        </w:rPr>
+        <w:t xml:space="preserve">5. Feature engineering and model development</w:t>
+      </w:r>
+    </w:p>
+    <w:p>
+      <w:pPr>
+        <w:spacing w:after="40"/>
+        <w:ind w:left="360"/>
+      </w:pPr>
+      <w:r>
+        <w:rPr>
+          <w:rFonts w:ascii="Calibri" w:cs="Calibri" w:eastAsia="Calibri" w:hAnsi="Calibri"/>
+          <w:sz w:val="21"/>
+          <w:szCs w:val="21"/>
+        </w:rPr>
+        <w:t xml:space="preserve">6. Experiment tracking with MLflow</w:t>
+      </w:r>
+    </w:p>
+    <w:p>
+      <w:pPr>
+        <w:spacing w:after="40"/>
+        <w:ind w:left="360"/>
+      </w:pPr>
+      <w:r>
+        <w:rPr>
+          <w:rFonts w:ascii="Calibri" w:cs="Calibri" w:eastAsia="Calibri" w:hAnsi="Calibri"/>
+          <w:sz w:val="21"/>
+          <w:szCs w:val="21"/>
+        </w:rPr>
+        <w:t xml:space="preserve">7. Packaging, testing and CI/CD</w:t>
+      </w:r>
+    </w:p>
+    <w:p>
+      <w:pPr>
+        <w:spacing w:after="40"/>
+        <w:ind w:left="360"/>
+      </w:pPr>
+      <w:r>
+        <w:rPr>
+          <w:rFonts w:ascii="Calibri" w:cs="Calibri" w:eastAsia="Calibri" w:hAnsi="Calibri"/>
+          <w:sz w:val="21"/>
+          <w:szCs w:val="21"/>
+        </w:rPr>
+        <w:t xml:space="preserve">8. Containerisation and deployment</w:t>
+      </w:r>
+    </w:p>
+    <w:p>
+      <w:pPr>
+        <w:spacing w:after="40"/>
+        <w:ind w:left="360"/>
+      </w:pPr>
+      <w:r>
+        <w:rPr>
+          <w:rFonts w:ascii="Calibri" w:cs="Calibri" w:eastAsia="Calibri" w:hAnsi="Calibri"/>
+          <w:sz w:val="21"/>
+          <w:szCs w:val="21"/>
+        </w:rPr>
+        <w:t xml:space="preserve">9. Monitoring and logging</w:t>
+      </w:r>
+    </w:p>
+    <w:p>
+      <w:pPr>
+        <w:spacing w:after="40"/>
+        <w:ind w:left="360"/>
+      </w:pPr>
+      <w:r>
+        <w:rPr>
+          <w:rFonts w:ascii="Calibri" w:cs="Calibri" w:eastAsia="Calibri" w:hAnsi="Calibri"/>
+          <w:sz w:val="21"/>
+          <w:szCs w:val="21"/>
+        </w:rPr>
+        <w:t xml:space="preserve">10. Limitations and next steps</w:t>
+      </w:r>
+    </w:p>
+    <w:p>
+      <w:pPr>
+        <w:spacing w:after="40"/>
+        <w:ind w:left="360"/>
+      </w:pPr>
+      <w:r>
+        <w:rPr>
+          <w:rFonts w:ascii="Calibri" w:cs="Calibri" w:eastAsia="Calibri" w:hAnsi="Calibri"/>
+          <w:sz w:val="21"/>
+          <w:szCs w:val="21"/>
+        </w:rPr>
+        <w:t xml:space="preserve">11. Links</w:t>
       </w:r>
     </w:p>
     <w:p>
@@ -943,8 +1065,469 @@
           <w:sz w:val="22"/>
           <w:szCs w:val="22"/>
         </w:rPr>
-        <w:t xml:space="preserve">Prerequisites: Python 3.11+ (3.12 used in CI and Docker), Git, Docker, and Minikube or Docker Desktop Kubernetes.</w:t>
-      </w:r>
+        <w:t xml:space="preserve">Prerequisites: Python 3.11+ (3.12 used in CI and Docker), Git, Docker, and Minikube or Docker Desktop Kubernetes. The project was developed and verified in this environment:</w:t>
+      </w:r>
+    </w:p>
+    <w:tbl>
+      <w:tblPr>
+        <w:tblW w:type="dxa" w:w="9026"/>
+        <w:tblBorders>
+          <w:top w:val="single" w:color="auto" w:sz="4"/>
+          <w:left w:val="single" w:color="auto" w:sz="4"/>
+          <w:bottom w:val="single" w:color="auto" w:sz="4"/>
+          <w:right w:val="single" w:color="auto" w:sz="4"/>
+          <w:insideH w:val="single" w:color="auto" w:sz="4"/>
+          <w:insideV w:val="single" w:color="auto" w:sz="4"/>
+        </w:tblBorders>
+      </w:tblPr>
+      <w:tblGrid>
+        <w:gridCol w:w="2400"/>
+        <w:gridCol w:w="6626"/>
+      </w:tblGrid>
+      <w:tr>
+        <w:trPr>
+          <w:tblHeader/>
+        </w:trPr>
+        <w:tc>
+          <w:tcPr>
+            <w:tcW w:type="dxa" w:w="2400"/>
+            <w:tcBorders>
+              <w:top w:val="single" w:color="BFC5CE" w:sz="4"/>
+              <w:left w:val="single" w:color="BFC5CE" w:sz="4"/>
+              <w:bottom w:val="single" w:color="BFC5CE" w:sz="4"/>
+              <w:right w:val="single" w:color="BFC5CE" w:sz="4"/>
+            </w:tcBorders>
+            <w:shd w:fill="1F3A5F" w:val="clear"/>
+            <w:tcMar>
+              <w:top w:type="dxa" w:w="60"/>
+              <w:left w:type="dxa" w:w="100"/>
+              <w:bottom w:type="dxa" w:w="60"/>
+              <w:right w:type="dxa" w:w="100"/>
+            </w:tcMar>
+          </w:tcPr>
+          <w:p>
+            <w:r>
+              <w:rPr>
+                <w:rFonts w:ascii="Calibri" w:cs="Calibri" w:eastAsia="Calibri" w:hAnsi="Calibri"/>
+                <w:b/>
+                <w:bCs/>
+                <w:color w:val="FFFFFF"/>
+                <w:sz w:val="19"/>
+                <w:szCs w:val="19"/>
+              </w:rPr>
+              <w:t xml:space="preserve">Component</w:t>
+            </w:r>
+          </w:p>
+        </w:tc>
+        <w:tc>
+          <w:tcPr>
+            <w:tcW w:type="dxa" w:w="6626"/>
+            <w:tcBorders>
+              <w:top w:val="single" w:color="BFC5CE" w:sz="4"/>
+              <w:left w:val="single" w:color="BFC5CE" w:sz="4"/>
+              <w:bottom w:val="single" w:color="BFC5CE" w:sz="4"/>
+              <w:right w:val="single" w:color="BFC5CE" w:sz="4"/>
+            </w:tcBorders>
+            <w:shd w:fill="1F3A5F" w:val="clear"/>
+            <w:tcMar>
+              <w:top w:type="dxa" w:w="60"/>
+              <w:left w:type="dxa" w:w="100"/>
+              <w:bottom w:type="dxa" w:w="60"/>
+              <w:right w:type="dxa" w:w="100"/>
+            </w:tcMar>
+          </w:tcPr>
+          <w:p>
+            <w:r>
+              <w:rPr>
+                <w:rFonts w:ascii="Calibri" w:cs="Calibri" w:eastAsia="Calibri" w:hAnsi="Calibri"/>
+                <w:b/>
+                <w:bCs/>
+                <w:color w:val="FFFFFF"/>
+                <w:sz w:val="19"/>
+                <w:szCs w:val="19"/>
+              </w:rPr>
+              <w:t xml:space="preserve">Version / details</w:t>
+            </w:r>
+          </w:p>
+        </w:tc>
+      </w:tr>
+      <w:tr>
+        <w:tc>
+          <w:tcPr>
+            <w:tcW w:type="dxa" w:w="2400"/>
+            <w:tcBorders>
+              <w:top w:val="single" w:color="BFC5CE" w:sz="4"/>
+              <w:left w:val="single" w:color="BFC5CE" w:sz="4"/>
+              <w:bottom w:val="single" w:color="BFC5CE" w:sz="4"/>
+              <w:right w:val="single" w:color="BFC5CE" w:sz="4"/>
+            </w:tcBorders>
+            <w:tcMar>
+              <w:top w:type="dxa" w:w="60"/>
+              <w:left w:type="dxa" w:w="100"/>
+              <w:bottom w:type="dxa" w:w="60"/>
+              <w:right w:type="dxa" w:w="100"/>
+            </w:tcMar>
+          </w:tcPr>
+          <w:p>
+            <w:r>
+              <w:rPr>
+                <w:rFonts w:ascii="Calibri" w:cs="Calibri" w:eastAsia="Calibri" w:hAnsi="Calibri"/>
+                <w:b w:val="false"/>
+                <w:bCs w:val="false"/>
+                <w:color w:val="222222"/>
+                <w:sz w:val="19"/>
+                <w:szCs w:val="19"/>
+              </w:rPr>
+              <w:t xml:space="preserve">Lab VM</w:t>
+            </w:r>
+          </w:p>
+        </w:tc>
+        <w:tc>
+          <w:tcPr>
+            <w:tcW w:type="dxa" w:w="6626"/>
+            <w:tcBorders>
+              <w:top w:val="single" w:color="BFC5CE" w:sz="4"/>
+              <w:left w:val="single" w:color="BFC5CE" w:sz="4"/>
+              <w:bottom w:val="single" w:color="BFC5CE" w:sz="4"/>
+              <w:right w:val="single" w:color="BFC5CE" w:sz="4"/>
+            </w:tcBorders>
+            <w:tcMar>
+              <w:top w:type="dxa" w:w="60"/>
+              <w:left w:type="dxa" w:w="100"/>
+              <w:bottom w:type="dxa" w:w="60"/>
+              <w:right w:type="dxa" w:w="100"/>
+            </w:tcMar>
+          </w:tcPr>
+          <w:p>
+            <w:r>
+              <w:rPr>
+                <w:rFonts w:ascii="Calibri" w:cs="Calibri" w:eastAsia="Calibri" w:hAnsi="Calibri"/>
+                <w:b w:val="false"/>
+                <w:bCs w:val="false"/>
+                <w:color w:val="222222"/>
+                <w:sz w:val="19"/>
+                <w:szCs w:val="19"/>
+              </w:rPr>
+              <w:t xml:space="preserve">Rocky Linux 9.5, 4 vCPU, 15 GB RAM (BITS Prayogshala)</w:t>
+            </w:r>
+          </w:p>
+        </w:tc>
+      </w:tr>
+      <w:tr>
+        <w:tc>
+          <w:tcPr>
+            <w:tcW w:type="dxa" w:w="2400"/>
+            <w:tcBorders>
+              <w:top w:val="single" w:color="BFC5CE" w:sz="4"/>
+              <w:left w:val="single" w:color="BFC5CE" w:sz="4"/>
+              <w:bottom w:val="single" w:color="BFC5CE" w:sz="4"/>
+              <w:right w:val="single" w:color="BFC5CE" w:sz="4"/>
+            </w:tcBorders>
+            <w:tcMar>
+              <w:top w:type="dxa" w:w="60"/>
+              <w:left w:type="dxa" w:w="100"/>
+              <w:bottom w:type="dxa" w:w="60"/>
+              <w:right w:type="dxa" w:w="100"/>
+            </w:tcMar>
+          </w:tcPr>
+          <w:p>
+            <w:r>
+              <w:rPr>
+                <w:rFonts w:ascii="Calibri" w:cs="Calibri" w:eastAsia="Calibri" w:hAnsi="Calibri"/>
+                <w:b w:val="false"/>
+                <w:bCs w:val="false"/>
+                <w:color w:val="222222"/>
+                <w:sz w:val="19"/>
+                <w:szCs w:val="19"/>
+              </w:rPr>
+              <w:t xml:space="preserve">Python</w:t>
+            </w:r>
+          </w:p>
+        </w:tc>
+        <w:tc>
+          <w:tcPr>
+            <w:tcW w:type="dxa" w:w="6626"/>
+            <w:tcBorders>
+              <w:top w:val="single" w:color="BFC5CE" w:sz="4"/>
+              <w:left w:val="single" w:color="BFC5CE" w:sz="4"/>
+              <w:bottom w:val="single" w:color="BFC5CE" w:sz="4"/>
+              <w:right w:val="single" w:color="BFC5CE" w:sz="4"/>
+            </w:tcBorders>
+            <w:tcMar>
+              <w:top w:type="dxa" w:w="60"/>
+              <w:left w:type="dxa" w:w="100"/>
+              <w:bottom w:type="dxa" w:w="60"/>
+              <w:right w:type="dxa" w:w="100"/>
+            </w:tcMar>
+          </w:tcPr>
+          <w:p>
+            <w:r>
+              <w:rPr>
+                <w:rFonts w:ascii="Calibri" w:cs="Calibri" w:eastAsia="Calibri" w:hAnsi="Calibri"/>
+                <w:b w:val="false"/>
+                <w:bCs w:val="false"/>
+                <w:color w:val="222222"/>
+                <w:sz w:val="19"/>
+                <w:szCs w:val="19"/>
+              </w:rPr>
+              <w:t xml:space="preserve">3.12.15 in a conda environment kept on the persistent workspace disk</w:t>
+            </w:r>
+          </w:p>
+        </w:tc>
+      </w:tr>
+      <w:tr>
+        <w:tc>
+          <w:tcPr>
+            <w:tcW w:type="dxa" w:w="2400"/>
+            <w:tcBorders>
+              <w:top w:val="single" w:color="BFC5CE" w:sz="4"/>
+              <w:left w:val="single" w:color="BFC5CE" w:sz="4"/>
+              <w:bottom w:val="single" w:color="BFC5CE" w:sz="4"/>
+              <w:right w:val="single" w:color="BFC5CE" w:sz="4"/>
+            </w:tcBorders>
+            <w:tcMar>
+              <w:top w:type="dxa" w:w="60"/>
+              <w:left w:type="dxa" w:w="100"/>
+              <w:bottom w:type="dxa" w:w="60"/>
+              <w:right w:type="dxa" w:w="100"/>
+            </w:tcMar>
+          </w:tcPr>
+          <w:p>
+            <w:r>
+              <w:rPr>
+                <w:rFonts w:ascii="Calibri" w:cs="Calibri" w:eastAsia="Calibri" w:hAnsi="Calibri"/>
+                <w:b w:val="false"/>
+                <w:bCs w:val="false"/>
+                <w:color w:val="222222"/>
+                <w:sz w:val="19"/>
+                <w:szCs w:val="19"/>
+              </w:rPr>
+              <w:t xml:space="preserve">Docker</w:t>
+            </w:r>
+          </w:p>
+        </w:tc>
+        <w:tc>
+          <w:tcPr>
+            <w:tcW w:type="dxa" w:w="6626"/>
+            <w:tcBorders>
+              <w:top w:val="single" w:color="BFC5CE" w:sz="4"/>
+              <w:left w:val="single" w:color="BFC5CE" w:sz="4"/>
+              <w:bottom w:val="single" w:color="BFC5CE" w:sz="4"/>
+              <w:right w:val="single" w:color="BFC5CE" w:sz="4"/>
+            </w:tcBorders>
+            <w:tcMar>
+              <w:top w:type="dxa" w:w="60"/>
+              <w:left w:type="dxa" w:w="100"/>
+              <w:bottom w:type="dxa" w:w="60"/>
+              <w:right w:type="dxa" w:w="100"/>
+            </w:tcMar>
+          </w:tcPr>
+          <w:p>
+            <w:r>
+              <w:rPr>
+                <w:rFonts w:ascii="Calibri" w:cs="Calibri" w:eastAsia="Calibri" w:hAnsi="Calibri"/>
+                <w:b w:val="false"/>
+                <w:bCs w:val="false"/>
+                <w:color w:val="222222"/>
+                <w:sz w:val="19"/>
+                <w:szCs w:val="19"/>
+              </w:rPr>
+              <w:t xml:space="preserve">28.0.1</w:t>
+            </w:r>
+          </w:p>
+        </w:tc>
+      </w:tr>
+      <w:tr>
+        <w:tc>
+          <w:tcPr>
+            <w:tcW w:type="dxa" w:w="2400"/>
+            <w:tcBorders>
+              <w:top w:val="single" w:color="BFC5CE" w:sz="4"/>
+              <w:left w:val="single" w:color="BFC5CE" w:sz="4"/>
+              <w:bottom w:val="single" w:color="BFC5CE" w:sz="4"/>
+              <w:right w:val="single" w:color="BFC5CE" w:sz="4"/>
+            </w:tcBorders>
+            <w:tcMar>
+              <w:top w:type="dxa" w:w="60"/>
+              <w:left w:type="dxa" w:w="100"/>
+              <w:bottom w:type="dxa" w:w="60"/>
+              <w:right w:type="dxa" w:w="100"/>
+            </w:tcMar>
+          </w:tcPr>
+          <w:p>
+            <w:r>
+              <w:rPr>
+                <w:rFonts w:ascii="Calibri" w:cs="Calibri" w:eastAsia="Calibri" w:hAnsi="Calibri"/>
+                <w:b w:val="false"/>
+                <w:bCs w:val="false"/>
+                <w:color w:val="222222"/>
+                <w:sz w:val="19"/>
+                <w:szCs w:val="19"/>
+              </w:rPr>
+              <w:t xml:space="preserve">Kubernetes</w:t>
+            </w:r>
+          </w:p>
+        </w:tc>
+        <w:tc>
+          <w:tcPr>
+            <w:tcW w:type="dxa" w:w="6626"/>
+            <w:tcBorders>
+              <w:top w:val="single" w:color="BFC5CE" w:sz="4"/>
+              <w:left w:val="single" w:color="BFC5CE" w:sz="4"/>
+              <w:bottom w:val="single" w:color="BFC5CE" w:sz="4"/>
+              <w:right w:val="single" w:color="BFC5CE" w:sz="4"/>
+            </w:tcBorders>
+            <w:tcMar>
+              <w:top w:type="dxa" w:w="60"/>
+              <w:left w:type="dxa" w:w="100"/>
+              <w:bottom w:type="dxa" w:w="60"/>
+              <w:right w:type="dxa" w:w="100"/>
+            </w:tcMar>
+          </w:tcPr>
+          <w:p>
+            <w:r>
+              <w:rPr>
+                <w:rFonts w:ascii="Calibri" w:cs="Calibri" w:eastAsia="Calibri" w:hAnsi="Calibri"/>
+                <w:b w:val="false"/>
+                <w:bCs w:val="false"/>
+                <w:color w:val="222222"/>
+                <w:sz w:val="19"/>
+                <w:szCs w:val="19"/>
+              </w:rPr>
+              <w:t xml:space="preserve">Minikube 1.35 (docker driver) running Kubernetes 1.32, kubectl 1.32</w:t>
+            </w:r>
+          </w:p>
+        </w:tc>
+      </w:tr>
+      <w:tr>
+        <w:tc>
+          <w:tcPr>
+            <w:tcW w:type="dxa" w:w="2400"/>
+            <w:tcBorders>
+              <w:top w:val="single" w:color="BFC5CE" w:sz="4"/>
+              <w:left w:val="single" w:color="BFC5CE" w:sz="4"/>
+              <w:bottom w:val="single" w:color="BFC5CE" w:sz="4"/>
+              <w:right w:val="single" w:color="BFC5CE" w:sz="4"/>
+            </w:tcBorders>
+            <w:tcMar>
+              <w:top w:type="dxa" w:w="60"/>
+              <w:left w:type="dxa" w:w="100"/>
+              <w:bottom w:type="dxa" w:w="60"/>
+              <w:right w:type="dxa" w:w="100"/>
+            </w:tcMar>
+          </w:tcPr>
+          <w:p>
+            <w:r>
+              <w:rPr>
+                <w:rFonts w:ascii="Calibri" w:cs="Calibri" w:eastAsia="Calibri" w:hAnsi="Calibri"/>
+                <w:b w:val="false"/>
+                <w:bCs w:val="false"/>
+                <w:color w:val="222222"/>
+                <w:sz w:val="19"/>
+                <w:szCs w:val="19"/>
+              </w:rPr>
+              <w:t xml:space="preserve">CI</w:t>
+            </w:r>
+          </w:p>
+        </w:tc>
+        <w:tc>
+          <w:tcPr>
+            <w:tcW w:type="dxa" w:w="6626"/>
+            <w:tcBorders>
+              <w:top w:val="single" w:color="BFC5CE" w:sz="4"/>
+              <w:left w:val="single" w:color="BFC5CE" w:sz="4"/>
+              <w:bottom w:val="single" w:color="BFC5CE" w:sz="4"/>
+              <w:right w:val="single" w:color="BFC5CE" w:sz="4"/>
+            </w:tcBorders>
+            <w:tcMar>
+              <w:top w:type="dxa" w:w="60"/>
+              <w:left w:type="dxa" w:w="100"/>
+              <w:bottom w:type="dxa" w:w="60"/>
+              <w:right w:type="dxa" w:w="100"/>
+            </w:tcMar>
+          </w:tcPr>
+          <w:p>
+            <w:r>
+              <w:rPr>
+                <w:rFonts w:ascii="Calibri" w:cs="Calibri" w:eastAsia="Calibri" w:hAnsi="Calibri"/>
+                <w:b w:val="false"/>
+                <w:bCs w:val="false"/>
+                <w:color w:val="222222"/>
+                <w:sz w:val="19"/>
+                <w:szCs w:val="19"/>
+              </w:rPr>
+              <w:t xml:space="preserve">GitHub Actions, ubuntu-latest runners, Python 3.12</w:t>
+            </w:r>
+          </w:p>
+        </w:tc>
+      </w:tr>
+      <w:tr>
+        <w:tc>
+          <w:tcPr>
+            <w:tcW w:type="dxa" w:w="2400"/>
+            <w:tcBorders>
+              <w:top w:val="single" w:color="BFC5CE" w:sz="4"/>
+              <w:left w:val="single" w:color="BFC5CE" w:sz="4"/>
+              <w:bottom w:val="single" w:color="BFC5CE" w:sz="4"/>
+              <w:right w:val="single" w:color="BFC5CE" w:sz="4"/>
+            </w:tcBorders>
+            <w:tcMar>
+              <w:top w:type="dxa" w:w="60"/>
+              <w:left w:type="dxa" w:w="100"/>
+              <w:bottom w:type="dxa" w:w="60"/>
+              <w:right w:type="dxa" w:w="100"/>
+            </w:tcMar>
+          </w:tcPr>
+          <w:p>
+            <w:r>
+              <w:rPr>
+                <w:rFonts w:ascii="Calibri" w:cs="Calibri" w:eastAsia="Calibri" w:hAnsi="Calibri"/>
+                <w:b w:val="false"/>
+                <w:bCs w:val="false"/>
+                <w:color w:val="222222"/>
+                <w:sz w:val="19"/>
+                <w:szCs w:val="19"/>
+              </w:rPr>
+              <w:t xml:space="preserve">Source control</w:t>
+            </w:r>
+          </w:p>
+        </w:tc>
+        <w:tc>
+          <w:tcPr>
+            <w:tcW w:type="dxa" w:w="6626"/>
+            <w:tcBorders>
+              <w:top w:val="single" w:color="BFC5CE" w:sz="4"/>
+              <w:left w:val="single" w:color="BFC5CE" w:sz="4"/>
+              <w:bottom w:val="single" w:color="BFC5CE" w:sz="4"/>
+              <w:right w:val="single" w:color="BFC5CE" w:sz="4"/>
+            </w:tcBorders>
+            <w:tcMar>
+              <w:top w:type="dxa" w:w="60"/>
+              <w:left w:type="dxa" w:w="100"/>
+              <w:bottom w:type="dxa" w:w="60"/>
+              <w:right w:type="dxa" w:w="100"/>
+            </w:tcMar>
+          </w:tcPr>
+          <w:p>
+            <w:r>
+              <w:rPr>
+                <w:rFonts w:ascii="Calibri" w:cs="Calibri" w:eastAsia="Calibri" w:hAnsi="Calibri"/>
+                <w:b w:val="false"/>
+                <w:bCs w:val="false"/>
+                <w:color w:val="222222"/>
+                <w:sz w:val="19"/>
+                <w:szCs w:val="19"/>
+              </w:rPr>
+              <w:t xml:space="preserve">Git; pushes from both the lab VM and a Windows laptop to one GitHub repository</w:t>
+            </w:r>
+          </w:p>
+        </w:tc>
+      </w:tr>
+    </w:tbl>
+    <w:p>
+      <w:pPr>
+        <w:spacing w:after="120"/>
+      </w:pPr>
     </w:p>
     <w:p>
       <w:pPr>
@@ -958,7 +1541,7 @@
           <w:sz w:val="19"/>
           <w:szCs w:val="19"/>
         </w:rPr>
-        <w:t xml:space="preserve">git clone https://github.com/&lt;your-user&gt;/heart-mlops.git &amp;&amp; cd heart-mlops</w:t>
+        <w:t xml:space="preserve">git clone https://github.com/2025ae05835/heart-mlops.git &amp;&amp; cd heart-mlops</w:t>
       </w:r>
     </w:p>
     <w:p>
@@ -1266,7 +1849,7 @@
           <w:sz w:val="22"/>
           <w:szCs w:val="22"/>
         </w:rPr>
-        <w:t xml:space="preserve">one exact duplicate row was removed, leaving 302 rows (164 no disease, 138 disease).</w:t>
+        <w:t xml:space="preserve">the official file contains no exact duplicates, so all 303 patients are kept (164 no disease, 139 disease).</w:t>
       </w:r>
     </w:p>
     <w:p>
@@ -1299,7 +1882,7 @@
       <w:r>
         <w:drawing>
           <wp:inline distT="0" distB="0" distL="0" distR="0">
-            <wp:extent cx="2476500" cy="2028825"/>
+            <wp:extent cx="2476500" cy="1990725"/>
             <wp:effectExtent t="0" r="0" b="0" l="0"/>
             <wp:docPr id="1" name="" descr="" title=""/>
             <wp:cNvGraphicFramePr>
@@ -1324,7 +1907,7 @@
                   <pic:spPr bwMode="auto">
                     <a:xfrm>
                       <a:off x="0" y="0"/>
-                      <a:ext cx="2476500" cy="2028825"/>
+                      <a:ext cx="2476500" cy="1990725"/>
                     </a:xfrm>
                     <a:prstGeom prst="rect">
                       <a:avLst/>
@@ -1438,7 +2021,7 @@
       <w:r>
         <w:drawing>
           <wp:inline distT="0" distB="0" distL="0" distR="0">
-            <wp:extent cx="5715000" cy="2476500"/>
+            <wp:extent cx="5715000" cy="2486025"/>
             <wp:effectExtent t="0" r="0" b="0" l="0"/>
             <wp:docPr id="1" name="" descr="" title=""/>
             <wp:cNvGraphicFramePr>
@@ -1463,7 +2046,7 @@
                   <pic:spPr bwMode="auto">
                     <a:xfrm>
                       <a:off x="0" y="0"/>
-                      <a:ext cx="5715000" cy="2476500"/>
+                      <a:ext cx="5715000" cy="2486025"/>
                     </a:xfrm>
                     <a:prstGeom prst="rect">
                       <a:avLst/>
@@ -1514,7 +2097,7 @@
       <w:r>
         <w:drawing>
           <wp:inline distT="0" distB="0" distL="0" distR="0">
-            <wp:extent cx="4476750" cy="4067175"/>
+            <wp:extent cx="4476750" cy="4048125"/>
             <wp:effectExtent t="0" r="0" b="0" l="0"/>
             <wp:docPr id="1" name="" descr="" title=""/>
             <wp:cNvGraphicFramePr>
@@ -1539,7 +2122,7 @@
                   <pic:spPr bwMode="auto">
                     <a:xfrm>
                       <a:off x="0" y="0"/>
-                      <a:ext cx="4476750" cy="4067175"/>
+                      <a:ext cx="4476750" cy="4048125"/>
                     </a:xfrm>
                     <a:prstGeom prst="rect">
                       <a:avLst/>
@@ -1833,7 +2416,7 @@
                 <w:sz w:val="19"/>
                 <w:szCs w:val="19"/>
               </w:rPr>
-              <w:t xml:space="preserve">−0.53</w:t>
+              <w:t xml:space="preserve">−0.52</w:t>
             </w:r>
           </w:p>
         </w:tc>
@@ -1895,7 +2478,7 @@
                 <w:sz w:val="19"/>
                 <w:szCs w:val="19"/>
               </w:rPr>
-              <w:t xml:space="preserve">+0.49</w:t>
+              <w:t xml:space="preserve">+0.48</w:t>
             </w:r>
           </w:p>
         </w:tc>
@@ -2139,7 +2722,7 @@
                 <w:sz w:val="19"/>
                 <w:szCs w:val="19"/>
               </w:rPr>
-              <w:t xml:space="preserve">+0.44</w:t>
+              <w:t xml:space="preserve">+0.43</w:t>
             </w:r>
           </w:p>
         </w:tc>
@@ -2199,7 +2782,7 @@
                 <w:sz w:val="19"/>
                 <w:szCs w:val="19"/>
               </w:rPr>
-              <w:t xml:space="preserve">−0.31</w:t>
+              <w:t xml:space="preserve">−0.32</w:t>
             </w:r>
           </w:p>
         </w:tc>
@@ -2654,7 +3237,7 @@
                 <w:sz w:val="19"/>
                 <w:szCs w:val="19"/>
               </w:rPr>
-              <w:t xml:space="preserve">C = 0.1, L2, class_weight = balanced</w:t>
+              <w:t xml:space="preserve">C = 0.3, L2 (l1_ratio = 0), class_weight = balanced</w:t>
             </w:r>
           </w:p>
         </w:tc>
@@ -2746,7 +3329,7 @@
                 <w:sz w:val="19"/>
                 <w:szCs w:val="19"/>
               </w:rPr>
-              <w:t xml:space="preserve">200 trees, max_depth = None, min_samples_leaf = 5, max_features = sqrt</w:t>
+              <w:t xml:space="preserve">200 trees, max_depth = 5, min_samples_leaf = 3, max_features = sqrt</w:t>
             </w:r>
           </w:p>
         </w:tc>
@@ -2838,7 +3421,7 @@
                 <w:sz w:val="19"/>
                 <w:szCs w:val="19"/>
               </w:rPr>
-              <w:t xml:space="preserve">learning_rate = 0.03, max_depth = 2, 100 iterations, no L2</w:t>
+              <w:t xml:space="preserve">learning_rate = 0.03, max_depth = 2, 100 iterations, L2 = 1.0</w:t>
             </w:r>
           </w:p>
         </w:tc>
@@ -3122,8 +3705,8 @@
             <w:r>
               <w:rPr>
                 <w:rFonts w:ascii="Calibri" w:cs="Calibri" w:eastAsia="Calibri" w:hAnsi="Calibri"/>
-                <w:b w:val="false"/>
-                <w:bCs w:val="false"/>
+                <w:b/>
+                <w:bCs/>
                 <w:color w:val="222222"/>
                 <w:sz w:val="19"/>
                 <w:szCs w:val="19"/>
@@ -3152,13 +3735,13 @@
             <w:r>
               <w:rPr>
                 <w:rFonts w:ascii="Calibri" w:cs="Calibri" w:eastAsia="Calibri" w:hAnsi="Calibri"/>
-                <w:b w:val="false"/>
-                <w:bCs w:val="false"/>
-                <w:color w:val="222222"/>
-                <w:sz w:val="19"/>
-                <w:szCs w:val="19"/>
-              </w:rPr>
-              <w:t xml:space="preserve">0.909 ± 0.036</w:t>
+                <w:b/>
+                <w:bCs/>
+                <w:color w:val="222222"/>
+                <w:sz w:val="19"/>
+                <w:szCs w:val="19"/>
+              </w:rPr>
+              <w:t xml:space="preserve">0.907 ± 0.019</w:t>
             </w:r>
           </w:p>
         </w:tc>
@@ -3182,13 +3765,13 @@
             <w:r>
               <w:rPr>
                 <w:rFonts w:ascii="Calibri" w:cs="Calibri" w:eastAsia="Calibri" w:hAnsi="Calibri"/>
-                <w:b w:val="false"/>
-                <w:bCs w:val="false"/>
-                <w:color w:val="222222"/>
-                <w:sz w:val="19"/>
-                <w:szCs w:val="19"/>
-              </w:rPr>
-              <w:t xml:space="preserve">0.830</w:t>
+                <w:b/>
+                <w:bCs/>
+                <w:color w:val="222222"/>
+                <w:sz w:val="19"/>
+                <w:szCs w:val="19"/>
+              </w:rPr>
+              <w:t xml:space="preserve">0.855</w:t>
             </w:r>
           </w:p>
         </w:tc>
@@ -3212,13 +3795,13 @@
             <w:r>
               <w:rPr>
                 <w:rFonts w:ascii="Calibri" w:cs="Calibri" w:eastAsia="Calibri" w:hAnsi="Calibri"/>
-                <w:b w:val="false"/>
-                <w:bCs w:val="false"/>
-                <w:color w:val="222222"/>
-                <w:sz w:val="19"/>
-                <w:szCs w:val="19"/>
-              </w:rPr>
-              <w:t xml:space="preserve">0.814</w:t>
+                <w:b/>
+                <w:bCs/>
+                <w:color w:val="222222"/>
+                <w:sz w:val="19"/>
+                <w:szCs w:val="19"/>
+              </w:rPr>
+              <w:t xml:space="preserve">0.834</w:t>
             </w:r>
           </w:p>
         </w:tc>
@@ -3242,13 +3825,13 @@
             <w:r>
               <w:rPr>
                 <w:rFonts w:ascii="Calibri" w:cs="Calibri" w:eastAsia="Calibri" w:hAnsi="Calibri"/>
-                <w:b w:val="false"/>
-                <w:bCs w:val="false"/>
-                <w:color w:val="222222"/>
-                <w:sz w:val="19"/>
-                <w:szCs w:val="19"/>
-              </w:rPr>
-              <w:t xml:space="preserve">0.921</w:t>
+                <w:b/>
+                <w:bCs/>
+                <w:color w:val="222222"/>
+                <w:sz w:val="19"/>
+                <w:szCs w:val="19"/>
+              </w:rPr>
+              <w:t xml:space="preserve">0.961</w:t>
             </w:r>
           </w:p>
         </w:tc>
@@ -3272,13 +3855,13 @@
             <w:r>
               <w:rPr>
                 <w:rFonts w:ascii="Calibri" w:cs="Calibri" w:eastAsia="Calibri" w:hAnsi="Calibri"/>
-                <w:b w:val="false"/>
-                <w:bCs w:val="false"/>
-                <w:color w:val="222222"/>
-                <w:sz w:val="19"/>
-                <w:szCs w:val="19"/>
-              </w:rPr>
-              <w:t xml:space="preserve">0.852</w:t>
+                <w:b/>
+                <w:bCs/>
+                <w:color w:val="222222"/>
+                <w:sz w:val="19"/>
+                <w:szCs w:val="19"/>
+              </w:rPr>
+              <w:t xml:space="preserve">0.869</w:t>
             </w:r>
           </w:p>
         </w:tc>
@@ -3302,13 +3885,13 @@
             <w:r>
               <w:rPr>
                 <w:rFonts w:ascii="Calibri" w:cs="Calibri" w:eastAsia="Calibri" w:hAnsi="Calibri"/>
-                <w:b w:val="false"/>
-                <w:bCs w:val="false"/>
-                <w:color w:val="222222"/>
-                <w:sz w:val="19"/>
-                <w:szCs w:val="19"/>
-              </w:rPr>
-              <w:t xml:space="preserve">0.821</w:t>
+                <w:b/>
+                <w:bCs/>
+                <w:color w:val="222222"/>
+                <w:sz w:val="19"/>
+                <w:szCs w:val="19"/>
+              </w:rPr>
+              <w:t xml:space="preserve">0.929</w:t>
             </w:r>
           </w:p>
         </w:tc>
@@ -3334,8 +3917,8 @@
             <w:r>
               <w:rPr>
                 <w:rFonts w:ascii="Calibri" w:cs="Calibri" w:eastAsia="Calibri" w:hAnsi="Calibri"/>
-                <w:b/>
-                <w:bCs/>
+                <w:b w:val="false"/>
+                <w:bCs w:val="false"/>
                 <w:color w:val="222222"/>
                 <w:sz w:val="19"/>
                 <w:szCs w:val="19"/>
@@ -3364,13 +3947,13 @@
             <w:r>
               <w:rPr>
                 <w:rFonts w:ascii="Calibri" w:cs="Calibri" w:eastAsia="Calibri" w:hAnsi="Calibri"/>
-                <w:b/>
-                <w:bCs/>
-                <w:color w:val="222222"/>
-                <w:sz w:val="19"/>
-                <w:szCs w:val="19"/>
-              </w:rPr>
-              <w:t xml:space="preserve">0.917 ± 0.029</w:t>
+                <w:b w:val="false"/>
+                <w:bCs w:val="false"/>
+                <w:color w:val="222222"/>
+                <w:sz w:val="19"/>
+                <w:szCs w:val="19"/>
+              </w:rPr>
+              <w:t xml:space="preserve">0.902 ± 0.021</w:t>
             </w:r>
           </w:p>
         </w:tc>
@@ -3394,13 +3977,13 @@
             <w:r>
               <w:rPr>
                 <w:rFonts w:ascii="Calibri" w:cs="Calibri" w:eastAsia="Calibri" w:hAnsi="Calibri"/>
-                <w:b/>
-                <w:bCs/>
-                <w:color w:val="222222"/>
-                <w:sz w:val="19"/>
-                <w:szCs w:val="19"/>
-              </w:rPr>
-              <w:t xml:space="preserve">0.842</w:t>
+                <w:b w:val="false"/>
+                <w:bCs w:val="false"/>
+                <w:color w:val="222222"/>
+                <w:sz w:val="19"/>
+                <w:szCs w:val="19"/>
+              </w:rPr>
+              <w:t xml:space="preserve">0.814</w:t>
             </w:r>
           </w:p>
         </w:tc>
@@ -3424,13 +4007,13 @@
             <w:r>
               <w:rPr>
                 <w:rFonts w:ascii="Calibri" w:cs="Calibri" w:eastAsia="Calibri" w:hAnsi="Calibri"/>
-                <w:b/>
-                <w:bCs/>
-                <w:color w:val="222222"/>
-                <w:sz w:val="19"/>
-                <w:szCs w:val="19"/>
-              </w:rPr>
-              <w:t xml:space="preserve">0.827</w:t>
+                <w:b w:val="false"/>
+                <w:bCs w:val="false"/>
+                <w:color w:val="222222"/>
+                <w:sz w:val="19"/>
+                <w:szCs w:val="19"/>
+              </w:rPr>
+              <w:t xml:space="preserve">0.785</w:t>
             </w:r>
           </w:p>
         </w:tc>
@@ -3454,13 +4037,13 @@
             <w:r>
               <w:rPr>
                 <w:rFonts w:ascii="Calibri" w:cs="Calibri" w:eastAsia="Calibri" w:hAnsi="Calibri"/>
-                <w:b/>
-                <w:bCs/>
-                <w:color w:val="222222"/>
-                <w:sz w:val="19"/>
-                <w:szCs w:val="19"/>
-              </w:rPr>
-              <w:t xml:space="preserve">0.889</w:t>
+                <w:b w:val="false"/>
+                <w:bCs w:val="false"/>
+                <w:color w:val="222222"/>
+                <w:sz w:val="19"/>
+                <w:szCs w:val="19"/>
+              </w:rPr>
+              <w:t xml:space="preserve">0.955</w:t>
             </w:r>
           </w:p>
         </w:tc>
@@ -3484,13 +4067,13 @@
             <w:r>
               <w:rPr>
                 <w:rFonts w:ascii="Calibri" w:cs="Calibri" w:eastAsia="Calibri" w:hAnsi="Calibri"/>
-                <w:b/>
-                <w:bCs/>
-                <w:color w:val="222222"/>
-                <w:sz w:val="19"/>
-                <w:szCs w:val="19"/>
-              </w:rPr>
-              <w:t xml:space="preserve">0.787</w:t>
+                <w:b w:val="false"/>
+                <w:bCs w:val="false"/>
+                <w:color w:val="222222"/>
+                <w:sz w:val="19"/>
+                <w:szCs w:val="19"/>
+              </w:rPr>
+              <w:t xml:space="preserve">0.885</w:t>
             </w:r>
           </w:p>
         </w:tc>
@@ -3514,13 +4097,13 @@
             <w:r>
               <w:rPr>
                 <w:rFonts w:ascii="Calibri" w:cs="Calibri" w:eastAsia="Calibri" w:hAnsi="Calibri"/>
-                <w:b/>
-                <w:bCs/>
-                <w:color w:val="222222"/>
-                <w:sz w:val="19"/>
-                <w:szCs w:val="19"/>
-              </w:rPr>
-              <w:t xml:space="preserve">0.714</w:t>
+                <w:b w:val="false"/>
+                <w:bCs w:val="false"/>
+                <w:color w:val="222222"/>
+                <w:sz w:val="19"/>
+                <w:szCs w:val="19"/>
+              </w:rPr>
+              <w:t xml:space="preserve">0.929</w:t>
             </w:r>
           </w:p>
         </w:tc>
@@ -3582,7 +4165,7 @@
                 <w:sz w:val="19"/>
                 <w:szCs w:val="19"/>
               </w:rPr>
-              <w:t xml:space="preserve">0.895 ± 0.032</w:t>
+              <w:t xml:space="preserve">0.894 ± 0.025</w:t>
             </w:r>
           </w:p>
         </w:tc>
@@ -3612,7 +4195,7 @@
                 <w:sz w:val="19"/>
                 <w:szCs w:val="19"/>
               </w:rPr>
-              <w:t xml:space="preserve">0.822</w:t>
+              <w:t xml:space="preserve">0.834</w:t>
             </w:r>
           </w:p>
         </w:tc>
@@ -3642,7 +4225,7 @@
                 <w:sz w:val="19"/>
                 <w:szCs w:val="19"/>
               </w:rPr>
-              <w:t xml:space="preserve">0.802</w:t>
+              <w:t xml:space="preserve">0.813</w:t>
             </w:r>
           </w:p>
         </w:tc>
@@ -3672,7 +4255,7 @@
                 <w:sz w:val="19"/>
                 <w:szCs w:val="19"/>
               </w:rPr>
-              <w:t xml:space="preserve">0.896</w:t>
+              <w:t xml:space="preserve">0.948</w:t>
             </w:r>
           </w:p>
         </w:tc>
@@ -3702,7 +4285,7 @@
                 <w:sz w:val="19"/>
                 <w:szCs w:val="19"/>
               </w:rPr>
-              <w:t xml:space="preserve">0.820</w:t>
+              <w:t xml:space="preserve">0.885</w:t>
             </w:r>
           </w:p>
         </w:tc>
@@ -3732,7 +4315,7 @@
                 <w:sz w:val="19"/>
                 <w:szCs w:val="19"/>
               </w:rPr>
-              <w:t xml:space="preserve">0.714</w:t>
+              <w:t xml:space="preserve">0.893</w:t>
             </w:r>
           </w:p>
         </w:tc>
@@ -3751,7 +4334,7 @@
       <w:r>
         <w:drawing>
           <wp:inline distT="0" distB="0" distL="0" distR="0">
-            <wp:extent cx="2476500" cy="2571750"/>
+            <wp:extent cx="2381250" cy="2428875"/>
             <wp:effectExtent t="0" r="0" b="0" l="0"/>
             <wp:docPr id="1" name="" descr="" title=""/>
             <wp:cNvGraphicFramePr>
@@ -3776,7 +4359,7 @@
                   <pic:spPr bwMode="auto">
                     <a:xfrm>
                       <a:off x="0" y="0"/>
-                      <a:ext cx="2476500" cy="2571750"/>
+                      <a:ext cx="2381250" cy="2428875"/>
                     </a:xfrm>
                     <a:prstGeom prst="rect">
                       <a:avLst/>
@@ -3803,7 +4386,70 @@
           <w:sz w:val="18"/>
           <w:szCs w:val="18"/>
         </w:rPr>
-        <w:t xml:space="preserve">Figure 6. Hold-out ROC curve, Random Forest</w:t>
+        <w:t xml:space="preserve">Figure 6. Hold-out ROC curve, Logistic Regression</w:t>
+      </w:r>
+    </w:p>
+    <w:p>
+      <w:pPr>
+        <w:spacing w:after="40"/>
+        <w:jc w:val="center"/>
+      </w:pPr>
+      <w:r>
+        <w:drawing>
+          <wp:inline distT="0" distB="0" distL="0" distR="0">
+            <wp:extent cx="3429000" cy="2333625"/>
+            <wp:effectExtent t="0" r="0" b="0" l="0"/>
+            <wp:docPr id="1" name="" descr="" title=""/>
+            <wp:cNvGraphicFramePr>
+              <a:graphicFrameLocks xmlns:a="http://schemas.openxmlformats.org/drawingml/2006/main" noChangeAspect="1"/>
+            </wp:cNvGraphicFramePr>
+            <a:graphic xmlns:a="http://schemas.openxmlformats.org/drawingml/2006/main">
+              <a:graphicData uri="http://schemas.openxmlformats.org/drawingml/2006/picture">
+                <pic:pic xmlns:pic="http://schemas.openxmlformats.org/drawingml/2006/picture">
+                  <pic:nvPicPr>
+                    <pic:cNvPr id="0" name="" descr=""/>
+                    <pic:cNvPicPr>
+                      <a:picLocks noChangeAspect="1" noChangeArrowheads="1"/>
+                    </pic:cNvPicPr>
+                  </pic:nvPicPr>
+                  <pic:blipFill>
+                    <a:blip r:embed="rId14" cstate="none"/>
+                    <a:srcRect/>
+                    <a:stretch>
+                      <a:fillRect/>
+                    </a:stretch>
+                  </pic:blipFill>
+                  <pic:spPr bwMode="auto">
+                    <a:xfrm>
+                      <a:off x="0" y="0"/>
+                      <a:ext cx="3429000" cy="2333625"/>
+                    </a:xfrm>
+                    <a:prstGeom prst="rect">
+                      <a:avLst/>
+                    </a:prstGeom>
+                  </pic:spPr>
+                </pic:pic>
+              </a:graphicData>
+            </a:graphic>
+          </wp:inline>
+        </w:drawing>
+      </w:r>
+    </w:p>
+    <w:p>
+      <w:pPr>
+        <w:spacing w:after="160"/>
+        <w:jc w:val="center"/>
+      </w:pPr>
+      <w:r>
+        <w:rPr>
+          <w:rFonts w:ascii="Calibri" w:cs="Calibri" w:eastAsia="Calibri" w:hAnsi="Calibri"/>
+          <w:i/>
+          <w:iCs/>
+          <w:color w:val="555555"/>
+          <w:sz w:val="18"/>
+          <w:szCs w:val="18"/>
+        </w:rPr>
+        <w:t xml:space="preserve">Figure 7. Largest absolute coefficients, Logistic Regression</w:t>
       </w:r>
     </w:p>
     <w:p>
@@ -3825,7 +4471,7 @@
           <w:sz w:val="22"/>
           <w:szCs w:val="22"/>
         </w:rPr>
-        <w:t xml:space="preserve">Random Forest has the best mean CV ROC-AUC and the lowest variance across folds, so it was selected. The 61-patient hold-out favours Logistic Regression, but with so few test patients one or two misclassifications move accuracy by 2–3 points; the five-fold CV estimate (on 241 patients) is the more reliable basis. The two models are within one standard deviation of each other, so Logistic Regression is a defensible, more interpretable alternative — this trade-off is recorded in MLflow for review. The selected configuration is finally refit on all 302 rows to produce the deployable model.</w:t>
+        <w:t xml:space="preserve">Logistic Regression has the best mean CV ROC-AUC (0.907) and the lowest variance across folds, and it also has the best hold-out ROC-AUC (0.961), so it was selected. Random Forest and Gradient Boosting reach slightly higher hold-out accuracy (0.885 vs 0.869), but with only 61 test patients that gap is a single patient, while ROC-AUC measures how well each model ranks every patient by risk. The three models are within about one standard deviation of each other, so the simplest model wins: its coefficients can be read directly (Figure 7): the largest belong to the number of coloured vessels, sex, the thalassemia result and asymptomatic chest pain, the same signals the EDA highlighted. class_weight = balanced favours recall, which reaches 0.929 on the hold-out. The selected configuration is finally refit on all 303 rows to produce the deployable model.</w:t>
       </w:r>
     </w:p>
     <w:p>
@@ -3950,68 +4596,204 @@
     </w:p>
     <w:p>
       <w:pPr>
-        <w:pBdr>
-          <w:top w:val="dashed" w:color="C9A227" w:sz="6"/>
-          <w:bottom w:val="dashed" w:color="C9A227" w:sz="6"/>
-          <w:left w:val="dashed" w:color="C9A227" w:sz="6"/>
-          <w:right w:val="dashed" w:color="C9A227" w:sz="6"/>
-        </w:pBdr>
-        <w:shd w:fill="FFF4CC" w:val="clear"/>
-        <w:spacing w:after="200" w:before="120"/>
+        <w:spacing w:after="120" w:line="276"/>
+      </w:pPr>
+      <w:r>
+        <w:rPr>
+          <w:rFonts w:ascii="Calibri" w:cs="Calibri" w:eastAsia="Calibri" w:hAnsi="Calibri"/>
+          <w:sz w:val="22"/>
+          <w:szCs w:val="22"/>
+        </w:rPr>
+        <w:t xml:space="preserve">Figure 8 shows the experiment after two separate training sessions. Every metric of the second session is identical to the first (for example CV ROC-AUC 0.90749 for Logistic Regression in both), which confirms that the pipeline is deterministic. The final_logistic_regression runs carry the registered model (heart-disease-classifier, versions 1 and 2) rather than metrics.</w:t>
+      </w:r>
+    </w:p>
+    <w:p>
+      <w:pPr>
+        <w:spacing w:after="40"/>
         <w:jc w:val="center"/>
       </w:pPr>
       <w:r>
-        <w:rPr>
-          <w:rFonts w:ascii="Calibri" w:cs="Calibri" w:eastAsia="Calibri" w:hAnsi="Calibri"/>
-          <w:b/>
-          <w:bCs/>
-          <w:color w:val="7A5C00"/>
-          <w:sz w:val="20"/>
-          <w:szCs w:val="20"/>
-        </w:rPr>
-        <w:t xml:space="preserve">[INSERT SCREENSHOT: screenshots/01_mlflow_experiments.png]  </w:t>
-      </w:r>
-      <w:r>
-        <w:rPr>
-          <w:rFonts w:ascii="Calibri" w:cs="Calibri" w:eastAsia="Calibri" w:hAnsi="Calibri"/>
-          <w:color w:val="7A5C00"/>
-          <w:sz w:val="20"/>
-          <w:szCs w:val="20"/>
-        </w:rPr>
-        <w:t xml:space="preserve">MLflow run list with metric columns</w:t>
-      </w:r>
-    </w:p>
-    <w:p>
-      <w:pPr>
-        <w:pBdr>
-          <w:top w:val="dashed" w:color="C9A227" w:sz="6"/>
-          <w:bottom w:val="dashed" w:color="C9A227" w:sz="6"/>
-          <w:left w:val="dashed" w:color="C9A227" w:sz="6"/>
-          <w:right w:val="dashed" w:color="C9A227" w:sz="6"/>
-        </w:pBdr>
-        <w:shd w:fill="FFF4CC" w:val="clear"/>
-        <w:spacing w:after="200" w:before="120"/>
+        <w:drawing>
+          <wp:inline distT="0" distB="0" distL="0" distR="0">
+            <wp:extent cx="5334000" cy="2724150"/>
+            <wp:effectExtent t="0" r="0" b="0" l="0"/>
+            <wp:docPr id="1" name="" descr="" title=""/>
+            <wp:cNvGraphicFramePr>
+              <a:graphicFrameLocks xmlns:a="http://schemas.openxmlformats.org/drawingml/2006/main" noChangeAspect="1"/>
+            </wp:cNvGraphicFramePr>
+            <a:graphic xmlns:a="http://schemas.openxmlformats.org/drawingml/2006/main">
+              <a:graphicData uri="http://schemas.openxmlformats.org/drawingml/2006/picture">
+                <pic:pic xmlns:pic="http://schemas.openxmlformats.org/drawingml/2006/picture">
+                  <pic:nvPicPr>
+                    <pic:cNvPr id="0" name="" descr=""/>
+                    <pic:cNvPicPr>
+                      <a:picLocks noChangeAspect="1" noChangeArrowheads="1"/>
+                    </pic:cNvPicPr>
+                  </pic:nvPicPr>
+                  <pic:blipFill>
+                    <a:blip r:embed="rId15" cstate="none"/>
+                    <a:srcRect/>
+                    <a:stretch>
+                      <a:fillRect/>
+                    </a:stretch>
+                  </pic:blipFill>
+                  <pic:spPr bwMode="auto">
+                    <a:xfrm>
+                      <a:off x="0" y="0"/>
+                      <a:ext cx="5334000" cy="2724150"/>
+                    </a:xfrm>
+                    <a:prstGeom prst="rect">
+                      <a:avLst/>
+                    </a:prstGeom>
+                  </pic:spPr>
+                </pic:pic>
+              </a:graphicData>
+            </a:graphic>
+          </wp:inline>
+        </w:drawing>
+      </w:r>
+    </w:p>
+    <w:p>
+      <w:pPr>
+        <w:spacing w:after="160"/>
         <w:jc w:val="center"/>
       </w:pPr>
       <w:r>
         <w:rPr>
           <w:rFonts w:ascii="Calibri" w:cs="Calibri" w:eastAsia="Calibri" w:hAnsi="Calibri"/>
-          <w:b/>
-          <w:bCs/>
-          <w:color w:val="7A5C00"/>
-          <w:sz w:val="20"/>
-          <w:szCs w:val="20"/>
-        </w:rPr>
-        <w:t xml:space="preserve">[INSERT SCREENSHOT: screenshots/02_mlflow_compare.png]  </w:t>
-      </w:r>
-      <w:r>
-        <w:rPr>
-          <w:rFonts w:ascii="Calibri" w:cs="Calibri" w:eastAsia="Calibri" w:hAnsi="Calibri"/>
-          <w:color w:val="7A5C00"/>
-          <w:sz w:val="20"/>
-          <w:szCs w:val="20"/>
-        </w:rPr>
-        <w:t xml:space="preserve">MLflow compare view of the three runs</w:t>
+          <w:i/>
+          <w:iCs/>
+          <w:color w:val="555555"/>
+          <w:sz w:val="18"/>
+          <w:szCs w:val="18"/>
+        </w:rPr>
+        <w:t xml:space="preserve">Figure 8. MLflow runs with CV and hold-out metrics (two identical training sessions)</w:t>
+      </w:r>
+    </w:p>
+    <w:p>
+      <w:pPr>
+        <w:spacing w:after="40"/>
+        <w:jc w:val="center"/>
+      </w:pPr>
+      <w:r>
+        <w:drawing>
+          <wp:inline distT="0" distB="0" distL="0" distR="0">
+            <wp:extent cx="5334000" cy="2705100"/>
+            <wp:effectExtent t="0" r="0" b="0" l="0"/>
+            <wp:docPr id="1" name="" descr="" title=""/>
+            <wp:cNvGraphicFramePr>
+              <a:graphicFrameLocks xmlns:a="http://schemas.openxmlformats.org/drawingml/2006/main" noChangeAspect="1"/>
+            </wp:cNvGraphicFramePr>
+            <a:graphic xmlns:a="http://schemas.openxmlformats.org/drawingml/2006/main">
+              <a:graphicData uri="http://schemas.openxmlformats.org/drawingml/2006/picture">
+                <pic:pic xmlns:pic="http://schemas.openxmlformats.org/drawingml/2006/picture">
+                  <pic:nvPicPr>
+                    <pic:cNvPr id="0" name="" descr=""/>
+                    <pic:cNvPicPr>
+                      <a:picLocks noChangeAspect="1" noChangeArrowheads="1"/>
+                    </pic:cNvPicPr>
+                  </pic:nvPicPr>
+                  <pic:blipFill>
+                    <a:blip r:embed="rId16" cstate="none"/>
+                    <a:srcRect/>
+                    <a:stretch>
+                      <a:fillRect/>
+                    </a:stretch>
+                  </pic:blipFill>
+                  <pic:spPr bwMode="auto">
+                    <a:xfrm>
+                      <a:off x="0" y="0"/>
+                      <a:ext cx="5334000" cy="2705100"/>
+                    </a:xfrm>
+                    <a:prstGeom prst="rect">
+                      <a:avLst/>
+                    </a:prstGeom>
+                  </pic:spPr>
+                </pic:pic>
+              </a:graphicData>
+            </a:graphic>
+          </wp:inline>
+        </w:drawing>
+      </w:r>
+    </w:p>
+    <w:p>
+      <w:pPr>
+        <w:spacing w:after="160"/>
+        <w:jc w:val="center"/>
+      </w:pPr>
+      <w:r>
+        <w:rPr>
+          <w:rFonts w:ascii="Calibri" w:cs="Calibri" w:eastAsia="Calibri" w:hAnsi="Calibri"/>
+          <w:i/>
+          <w:iCs/>
+          <w:color w:val="555555"/>
+          <w:sz w:val="18"/>
+          <w:szCs w:val="18"/>
+        </w:rPr>
+        <w:t xml:space="preserve">Figure 9. MLflow compare view of the three tuned models</w:t>
+      </w:r>
+    </w:p>
+    <w:p>
+      <w:pPr>
+        <w:spacing w:after="40"/>
+        <w:jc w:val="center"/>
+      </w:pPr>
+      <w:r>
+        <w:drawing>
+          <wp:inline distT="0" distB="0" distL="0" distR="0">
+            <wp:extent cx="4762500" cy="2381250"/>
+            <wp:effectExtent t="0" r="0" b="0" l="0"/>
+            <wp:docPr id="1" name="" descr="" title=""/>
+            <wp:cNvGraphicFramePr>
+              <a:graphicFrameLocks xmlns:a="http://schemas.openxmlformats.org/drawingml/2006/main" noChangeAspect="1"/>
+            </wp:cNvGraphicFramePr>
+            <a:graphic xmlns:a="http://schemas.openxmlformats.org/drawingml/2006/main">
+              <a:graphicData uri="http://schemas.openxmlformats.org/drawingml/2006/picture">
+                <pic:pic xmlns:pic="http://schemas.openxmlformats.org/drawingml/2006/picture">
+                  <pic:nvPicPr>
+                    <pic:cNvPr id="0" name="" descr=""/>
+                    <pic:cNvPicPr>
+                      <a:picLocks noChangeAspect="1" noChangeArrowheads="1"/>
+                    </pic:cNvPicPr>
+                  </pic:nvPicPr>
+                  <pic:blipFill>
+                    <a:blip r:embed="rId17" cstate="none"/>
+                    <a:srcRect/>
+                    <a:stretch>
+                      <a:fillRect/>
+                    </a:stretch>
+                  </pic:blipFill>
+                  <pic:spPr bwMode="auto">
+                    <a:xfrm>
+                      <a:off x="0" y="0"/>
+                      <a:ext cx="4762500" cy="2381250"/>
+                    </a:xfrm>
+                    <a:prstGeom prst="rect">
+                      <a:avLst/>
+                    </a:prstGeom>
+                  </pic:spPr>
+                </pic:pic>
+              </a:graphicData>
+            </a:graphic>
+          </wp:inline>
+        </w:drawing>
+      </w:r>
+    </w:p>
+    <w:p>
+      <w:pPr>
+        <w:spacing w:after="160"/>
+        <w:jc w:val="center"/>
+      </w:pPr>
+      <w:r>
+        <w:rPr>
+          <w:rFonts w:ascii="Calibri" w:cs="Calibri" w:eastAsia="Calibri" w:hAnsi="Calibri"/>
+          <w:i/>
+          <w:iCs/>
+          <w:color w:val="555555"/>
+          <w:sz w:val="18"/>
+          <w:szCs w:val="18"/>
+        </w:rPr>
+        <w:t xml:space="preserve">Figure 10. Artifacts logged with the Logistic Regression run</w:t>
       </w:r>
     </w:p>
     <w:p>
@@ -4083,7 +4865,7 @@
           <w:sz w:val="22"/>
           <w:szCs w:val="22"/>
         </w:rPr>
-        <w:t xml:space="preserve">All versions are pinned; fixed random seeds make CV splits and forests deterministic.</w:t>
+        <w:t xml:space="preserve">All versions are pinned; fixed random seeds make CV splits and forests deterministic. Re-running the full training on a second machine from the GitHub repository reproduced every CV and hold-out score to three decimals.</w:t>
       </w:r>
     </w:p>
     <w:p>
@@ -4147,6 +4929,69 @@
           <w:szCs w:val="22"/>
         </w:rPr>
         <w:t xml:space="preserve">API: /health, /predict response and request-id header, 422 on invalid input, batch endpoint, /metrics exposure. API tests use a small model trained on synthetic data so they do not depend on a prior training run.</w:t>
+      </w:r>
+    </w:p>
+    <w:p>
+      <w:pPr>
+        <w:spacing w:after="40"/>
+        <w:jc w:val="center"/>
+      </w:pPr>
+      <w:r>
+        <w:drawing>
+          <wp:inline distT="0" distB="0" distL="0" distR="0">
+            <wp:extent cx="5143500" cy="2105025"/>
+            <wp:effectExtent t="0" r="0" b="0" l="0"/>
+            <wp:docPr id="1" name="" descr="" title=""/>
+            <wp:cNvGraphicFramePr>
+              <a:graphicFrameLocks xmlns:a="http://schemas.openxmlformats.org/drawingml/2006/main" noChangeAspect="1"/>
+            </wp:cNvGraphicFramePr>
+            <a:graphic xmlns:a="http://schemas.openxmlformats.org/drawingml/2006/main">
+              <a:graphicData uri="http://schemas.openxmlformats.org/drawingml/2006/picture">
+                <pic:pic xmlns:pic="http://schemas.openxmlformats.org/drawingml/2006/picture">
+                  <pic:nvPicPr>
+                    <pic:cNvPr id="0" name="" descr=""/>
+                    <pic:cNvPicPr>
+                      <a:picLocks noChangeAspect="1" noChangeArrowheads="1"/>
+                    </pic:cNvPicPr>
+                  </pic:nvPicPr>
+                  <pic:blipFill>
+                    <a:blip r:embed="rId18" cstate="none"/>
+                    <a:srcRect/>
+                    <a:stretch>
+                      <a:fillRect/>
+                    </a:stretch>
+                  </pic:blipFill>
+                  <pic:spPr bwMode="auto">
+                    <a:xfrm>
+                      <a:off x="0" y="0"/>
+                      <a:ext cx="5143500" cy="2105025"/>
+                    </a:xfrm>
+                    <a:prstGeom prst="rect">
+                      <a:avLst/>
+                    </a:prstGeom>
+                  </pic:spPr>
+                </pic:pic>
+              </a:graphicData>
+            </a:graphic>
+          </wp:inline>
+        </w:drawing>
+      </w:r>
+    </w:p>
+    <w:p>
+      <w:pPr>
+        <w:spacing w:after="160"/>
+        <w:jc w:val="center"/>
+      </w:pPr>
+      <w:r>
+        <w:rPr>
+          <w:rFonts w:ascii="Calibri" w:cs="Calibri" w:eastAsia="Calibri" w:hAnsi="Calibri"/>
+          <w:i/>
+          <w:iCs/>
+          <w:color w:val="555555"/>
+          <w:sz w:val="18"/>
+          <w:szCs w:val="18"/>
+        </w:rPr>
+        <w:t xml:space="preserve">Figure 11. Lint and all 18 unit tests passing locally</w:t>
       </w:r>
     </w:p>
     <w:p>
@@ -4662,68 +5507,204 @@
     </w:p>
     <w:p>
       <w:pPr>
-        <w:pBdr>
-          <w:top w:val="dashed" w:color="C9A227" w:sz="6"/>
-          <w:bottom w:val="dashed" w:color="C9A227" w:sz="6"/>
-          <w:left w:val="dashed" w:color="C9A227" w:sz="6"/>
-          <w:right w:val="dashed" w:color="C9A227" w:sz="6"/>
-        </w:pBdr>
-        <w:shd w:fill="FFF4CC" w:val="clear"/>
-        <w:spacing w:after="200" w:before="120"/>
+        <w:spacing w:after="40"/>
         <w:jc w:val="center"/>
       </w:pPr>
       <w:r>
-        <w:rPr>
-          <w:rFonts w:ascii="Calibri" w:cs="Calibri" w:eastAsia="Calibri" w:hAnsi="Calibri"/>
-          <w:b/>
-          <w:bCs/>
-          <w:color w:val="7A5C00"/>
-          <w:sz w:val="20"/>
-          <w:szCs w:val="20"/>
-        </w:rPr>
-        <w:t xml:space="preserve">[INSERT SCREENSHOT: screenshots/05_github_actions_run.png]  </w:t>
-      </w:r>
-      <w:r>
-        <w:rPr>
-          <w:rFonts w:ascii="Calibri" w:cs="Calibri" w:eastAsia="Calibri" w:hAnsi="Calibri"/>
-          <w:color w:val="7A5C00"/>
-          <w:sz w:val="20"/>
-          <w:szCs w:val="20"/>
-        </w:rPr>
-        <w:t xml:space="preserve">workflow run with all four jobs green</w:t>
-      </w:r>
-    </w:p>
-    <w:p>
-      <w:pPr>
-        <w:pBdr>
-          <w:top w:val="dashed" w:color="C9A227" w:sz="6"/>
-          <w:bottom w:val="dashed" w:color="C9A227" w:sz="6"/>
-          <w:left w:val="dashed" w:color="C9A227" w:sz="6"/>
-          <w:right w:val="dashed" w:color="C9A227" w:sz="6"/>
-        </w:pBdr>
-        <w:shd w:fill="FFF4CC" w:val="clear"/>
-        <w:spacing w:after="200" w:before="120"/>
+        <w:drawing>
+          <wp:inline distT="0" distB="0" distL="0" distR="0">
+            <wp:extent cx="5143500" cy="2800350"/>
+            <wp:effectExtent t="0" r="0" b="0" l="0"/>
+            <wp:docPr id="1" name="" descr="" title=""/>
+            <wp:cNvGraphicFramePr>
+              <a:graphicFrameLocks xmlns:a="http://schemas.openxmlformats.org/drawingml/2006/main" noChangeAspect="1"/>
+            </wp:cNvGraphicFramePr>
+            <a:graphic xmlns:a="http://schemas.openxmlformats.org/drawingml/2006/main">
+              <a:graphicData uri="http://schemas.openxmlformats.org/drawingml/2006/picture">
+                <pic:pic xmlns:pic="http://schemas.openxmlformats.org/drawingml/2006/picture">
+                  <pic:nvPicPr>
+                    <pic:cNvPr id="0" name="" descr=""/>
+                    <pic:cNvPicPr>
+                      <a:picLocks noChangeAspect="1" noChangeArrowheads="1"/>
+                    </pic:cNvPicPr>
+                  </pic:nvPicPr>
+                  <pic:blipFill>
+                    <a:blip r:embed="rId19" cstate="none"/>
+                    <a:srcRect/>
+                    <a:stretch>
+                      <a:fillRect/>
+                    </a:stretch>
+                  </pic:blipFill>
+                  <pic:spPr bwMode="auto">
+                    <a:xfrm>
+                      <a:off x="0" y="0"/>
+                      <a:ext cx="5143500" cy="2800350"/>
+                    </a:xfrm>
+                    <a:prstGeom prst="rect">
+                      <a:avLst/>
+                    </a:prstGeom>
+                  </pic:spPr>
+                </pic:pic>
+              </a:graphicData>
+            </a:graphic>
+          </wp:inline>
+        </w:drawing>
+      </w:r>
+    </w:p>
+    <w:p>
+      <w:pPr>
+        <w:spacing w:after="160"/>
         <w:jc w:val="center"/>
       </w:pPr>
       <w:r>
         <w:rPr>
           <w:rFonts w:ascii="Calibri" w:cs="Calibri" w:eastAsia="Calibri" w:hAnsi="Calibri"/>
-          <w:b/>
-          <w:bCs/>
-          <w:color w:val="7A5C00"/>
-          <w:sz w:val="20"/>
-          <w:szCs w:val="20"/>
-        </w:rPr>
-        <w:t xml:space="preserve">[INSERT SCREENSHOT: screenshots/06_github_actions_artifacts.png]  </w:t>
-      </w:r>
-      <w:r>
-        <w:rPr>
-          <w:rFonts w:ascii="Calibri" w:cs="Calibri" w:eastAsia="Calibri" w:hAnsi="Calibri"/>
-          <w:color w:val="7A5C00"/>
-          <w:sz w:val="20"/>
-          <w:szCs w:val="20"/>
-        </w:rPr>
-        <w:t xml:space="preserve">artifacts listed at the bottom of the run</w:t>
+          <w:i/>
+          <w:iCs/>
+          <w:color w:val="555555"/>
+          <w:sz w:val="18"/>
+          <w:szCs w:val="18"/>
+        </w:rPr>
+        <w:t xml:space="preserve">Figure 12. Successful pipeline run on main: lint, test, train, docker (4 min 58 s)</w:t>
+      </w:r>
+    </w:p>
+    <w:p>
+      <w:pPr>
+        <w:spacing w:after="40"/>
+        <w:jc w:val="center"/>
+      </w:pPr>
+      <w:r>
+        <w:drawing>
+          <wp:inline distT="0" distB="0" distL="0" distR="0">
+            <wp:extent cx="4953000" cy="2286000"/>
+            <wp:effectExtent t="0" r="0" b="0" l="0"/>
+            <wp:docPr id="1" name="" descr="" title=""/>
+            <wp:cNvGraphicFramePr>
+              <a:graphicFrameLocks xmlns:a="http://schemas.openxmlformats.org/drawingml/2006/main" noChangeAspect="1"/>
+            </wp:cNvGraphicFramePr>
+            <a:graphic xmlns:a="http://schemas.openxmlformats.org/drawingml/2006/main">
+              <a:graphicData uri="http://schemas.openxmlformats.org/drawingml/2006/picture">
+                <pic:pic xmlns:pic="http://schemas.openxmlformats.org/drawingml/2006/picture">
+                  <pic:nvPicPr>
+                    <pic:cNvPr id="0" name="" descr=""/>
+                    <pic:cNvPicPr>
+                      <a:picLocks noChangeAspect="1" noChangeArrowheads="1"/>
+                    </pic:cNvPicPr>
+                  </pic:nvPicPr>
+                  <pic:blipFill>
+                    <a:blip r:embed="rId20" cstate="none"/>
+                    <a:srcRect/>
+                    <a:stretch>
+                      <a:fillRect/>
+                    </a:stretch>
+                  </pic:blipFill>
+                  <pic:spPr bwMode="auto">
+                    <a:xfrm>
+                      <a:off x="0" y="0"/>
+                      <a:ext cx="4953000" cy="2286000"/>
+                    </a:xfrm>
+                    <a:prstGeom prst="rect">
+                      <a:avLst/>
+                    </a:prstGeom>
+                  </pic:spPr>
+                </pic:pic>
+              </a:graphicData>
+            </a:graphic>
+          </wp:inline>
+        </w:drawing>
+      </w:r>
+    </w:p>
+    <w:p>
+      <w:pPr>
+        <w:spacing w:after="160"/>
+        <w:jc w:val="center"/>
+      </w:pPr>
+      <w:r>
+        <w:rPr>
+          <w:rFonts w:ascii="Calibri" w:cs="Calibri" w:eastAsia="Calibri" w:hAnsi="Calibri"/>
+          <w:i/>
+          <w:iCs/>
+          <w:color w:val="555555"/>
+          <w:sz w:val="18"/>
+          <w:szCs w:val="18"/>
+        </w:rPr>
+        <w:t xml:space="preserve">Figure 13. Artifacts stored with the run</w:t>
+      </w:r>
+    </w:p>
+    <w:p>
+      <w:pPr>
+        <w:spacing w:after="120" w:line="276"/>
+      </w:pPr>
+      <w:r>
+        <w:rPr>
+          <w:rFonts w:ascii="Calibri" w:cs="Calibri" w:eastAsia="Calibri" w:hAnsi="Calibri"/>
+          <w:sz w:val="22"/>
+          <w:szCs w:val="22"/>
+        </w:rPr>
+        <w:t xml:space="preserve">To prove that the pipeline blocks bad code, a pull request with a deliberate style error was opened. The lint job failed after 6 seconds, the test, train and docker jobs were skipped, and GitHub marked the pull request as failing; it was closed without merging (Figure 14).</w:t>
+      </w:r>
+    </w:p>
+    <w:p>
+      <w:pPr>
+        <w:spacing w:after="40"/>
+        <w:jc w:val="center"/>
+      </w:pPr>
+      <w:r>
+        <w:drawing>
+          <wp:inline distT="0" distB="0" distL="0" distR="0">
+            <wp:extent cx="4953000" cy="2266950"/>
+            <wp:effectExtent t="0" r="0" b="0" l="0"/>
+            <wp:docPr id="1" name="" descr="" title=""/>
+            <wp:cNvGraphicFramePr>
+              <a:graphicFrameLocks xmlns:a="http://schemas.openxmlformats.org/drawingml/2006/main" noChangeAspect="1"/>
+            </wp:cNvGraphicFramePr>
+            <a:graphic xmlns:a="http://schemas.openxmlformats.org/drawingml/2006/main">
+              <a:graphicData uri="http://schemas.openxmlformats.org/drawingml/2006/picture">
+                <pic:pic xmlns:pic="http://schemas.openxmlformats.org/drawingml/2006/picture">
+                  <pic:nvPicPr>
+                    <pic:cNvPr id="0" name="" descr=""/>
+                    <pic:cNvPicPr>
+                      <a:picLocks noChangeAspect="1" noChangeArrowheads="1"/>
+                    </pic:cNvPicPr>
+                  </pic:nvPicPr>
+                  <pic:blipFill>
+                    <a:blip r:embed="rId21" cstate="none"/>
+                    <a:srcRect/>
+                    <a:stretch>
+                      <a:fillRect/>
+                    </a:stretch>
+                  </pic:blipFill>
+                  <pic:spPr bwMode="auto">
+                    <a:xfrm>
+                      <a:off x="0" y="0"/>
+                      <a:ext cx="4953000" cy="2266950"/>
+                    </a:xfrm>
+                    <a:prstGeom prst="rect">
+                      <a:avLst/>
+                    </a:prstGeom>
+                  </pic:spPr>
+                </pic:pic>
+              </a:graphicData>
+            </a:graphic>
+          </wp:inline>
+        </w:drawing>
+      </w:r>
+    </w:p>
+    <w:p>
+      <w:pPr>
+        <w:spacing w:after="160"/>
+        <w:jc w:val="center"/>
+      </w:pPr>
+      <w:r>
+        <w:rPr>
+          <w:rFonts w:ascii="Calibri" w:cs="Calibri" w:eastAsia="Calibri" w:hAnsi="Calibri"/>
+          <w:i/>
+          <w:iCs/>
+          <w:color w:val="555555"/>
+          <w:sz w:val="18"/>
+          <w:szCs w:val="18"/>
+        </w:rPr>
+        <w:t xml:space="preserve">Figure 14. Deliberate lint error in a pull request: pipeline fails, later jobs skipped</w:t>
       </w:r>
     </w:p>
     <w:p>
@@ -4814,7 +5795,7 @@
           <w:sz w:val="19"/>
           <w:szCs w:val="19"/>
         </w:rPr>
-        <w:t xml:space="preserve">{"prediction":1,"label":"heart_disease","probability_disease":0.9948,</w:t>
+        <w:t xml:space="preserve">{"prediction":1,"label":"heart_disease","probability_disease":0.9938,</w:t>
       </w:r>
     </w:p>
     <w:p>
@@ -4829,7 +5810,7 @@
           <w:sz w:val="19"/>
           <w:szCs w:val="19"/>
         </w:rPr>
-        <w:t xml:space="preserve"> "confidence":0.9948,"risk_band":"high","model_name":"random_forest","request_id":"3ff073d7f3f5"}</w:t>
+        <w:t xml:space="preserve"> "confidence":0.9938,"risk_band":"high","model_name":"logistic_regression","request_id":"..."}</w:t>
       </w:r>
     </w:p>
     <w:p>
@@ -4847,35 +5828,78 @@
     </w:p>
     <w:p>
       <w:pPr>
-        <w:pBdr>
-          <w:top w:val="dashed" w:color="C9A227" w:sz="6"/>
-          <w:bottom w:val="dashed" w:color="C9A227" w:sz="6"/>
-          <w:left w:val="dashed" w:color="C9A227" w:sz="6"/>
-          <w:right w:val="dashed" w:color="C9A227" w:sz="6"/>
-        </w:pBdr>
-        <w:shd w:fill="FFF4CC" w:val="clear"/>
-        <w:spacing w:after="200" w:before="120"/>
+        <w:spacing w:after="120" w:line="276"/>
+      </w:pPr>
+      <w:r>
+        <w:rPr>
+          <w:rFonts w:ascii="Calibri" w:cs="Calibri" w:eastAsia="Calibri" w:hAnsi="Calibri"/>
+          <w:sz w:val="22"/>
+          <w:szCs w:val="22"/>
+        </w:rPr>
+        <w:t xml:space="preserve">Running the image locally: the container reports healthy, /health returns the loaded model and its metrics, the high-risk and low-risk sample patients get 0.9938 and 0.0298, an invalid request gets HTTP 422, and every request is logged as one JSON line with its latency (Figure 15).</w:t>
+      </w:r>
+    </w:p>
+    <w:p>
+      <w:pPr>
+        <w:spacing w:after="40"/>
         <w:jc w:val="center"/>
       </w:pPr>
       <w:r>
-        <w:rPr>
-          <w:rFonts w:ascii="Calibri" w:cs="Calibri" w:eastAsia="Calibri" w:hAnsi="Calibri"/>
-          <w:b/>
-          <w:bCs/>
-          <w:color w:val="7A5C00"/>
-          <w:sz w:val="20"/>
-          <w:szCs w:val="20"/>
-        </w:rPr>
-        <w:t xml:space="preserve">[INSERT SCREENSHOT: screenshots/07_docker_build_run.png]  </w:t>
-      </w:r>
-      <w:r>
-        <w:rPr>
-          <w:rFonts w:ascii="Calibri" w:cs="Calibri" w:eastAsia="Calibri" w:hAnsi="Calibri"/>
-          <w:color w:val="7A5C00"/>
-          <w:sz w:val="20"/>
-          <w:szCs w:val="20"/>
-        </w:rPr>
-        <w:t xml:space="preserve">docker build, docker run and the curl response</w:t>
+        <w:drawing>
+          <wp:inline distT="0" distB="0" distL="0" distR="0">
+            <wp:extent cx="5334000" cy="2771775"/>
+            <wp:effectExtent t="0" r="0" b="0" l="0"/>
+            <wp:docPr id="1" name="" descr="" title=""/>
+            <wp:cNvGraphicFramePr>
+              <a:graphicFrameLocks xmlns:a="http://schemas.openxmlformats.org/drawingml/2006/main" noChangeAspect="1"/>
+            </wp:cNvGraphicFramePr>
+            <a:graphic xmlns:a="http://schemas.openxmlformats.org/drawingml/2006/main">
+              <a:graphicData uri="http://schemas.openxmlformats.org/drawingml/2006/picture">
+                <pic:pic xmlns:pic="http://schemas.openxmlformats.org/drawingml/2006/picture">
+                  <pic:nvPicPr>
+                    <pic:cNvPr id="0" name="" descr=""/>
+                    <pic:cNvPicPr>
+                      <a:picLocks noChangeAspect="1" noChangeArrowheads="1"/>
+                    </pic:cNvPicPr>
+                  </pic:nvPicPr>
+                  <pic:blipFill>
+                    <a:blip r:embed="rId22" cstate="none"/>
+                    <a:srcRect/>
+                    <a:stretch>
+                      <a:fillRect/>
+                    </a:stretch>
+                  </pic:blipFill>
+                  <pic:spPr bwMode="auto">
+                    <a:xfrm>
+                      <a:off x="0" y="0"/>
+                      <a:ext cx="5334000" cy="2771775"/>
+                    </a:xfrm>
+                    <a:prstGeom prst="rect">
+                      <a:avLst/>
+                    </a:prstGeom>
+                  </pic:spPr>
+                </pic:pic>
+              </a:graphicData>
+            </a:graphic>
+          </wp:inline>
+        </w:drawing>
+      </w:r>
+    </w:p>
+    <w:p>
+      <w:pPr>
+        <w:spacing w:after="160"/>
+        <w:jc w:val="center"/>
+      </w:pPr>
+      <w:r>
+        <w:rPr>
+          <w:rFonts w:ascii="Calibri" w:cs="Calibri" w:eastAsia="Calibri" w:hAnsi="Calibri"/>
+          <w:i/>
+          <w:iCs/>
+          <w:color w:val="555555"/>
+          <w:sz w:val="18"/>
+          <w:szCs w:val="18"/>
+        </w:rPr>
+        <w:t xml:space="preserve">Figure 15. Container test: health, two predictions, input validation and JSON logs</w:t>
       </w:r>
     </w:p>
     <w:p>
@@ -4977,101 +6001,141 @@
     </w:p>
     <w:p>
       <w:pPr>
-        <w:pBdr>
-          <w:top w:val="dashed" w:color="C9A227" w:sz="6"/>
-          <w:bottom w:val="dashed" w:color="C9A227" w:sz="6"/>
-          <w:left w:val="dashed" w:color="C9A227" w:sz="6"/>
-          <w:right w:val="dashed" w:color="C9A227" w:sz="6"/>
-        </w:pBdr>
-        <w:shd w:fill="FFF4CC" w:val="clear"/>
-        <w:spacing w:after="200" w:before="120"/>
+        <w:spacing w:after="120" w:line="276"/>
+      </w:pPr>
+      <w:r>
+        <w:rPr>
+          <w:rFonts w:ascii="Calibri" w:cs="Calibri" w:eastAsia="Calibri" w:hAnsi="Calibri"/>
+          <w:sz w:val="22"/>
+          <w:szCs w:val="22"/>
+        </w:rPr>
+        <w:t xml:space="preserve">On Minikube, minikube tunnel assigns the LoadBalancer the external IP 10.96.111.167. Both API replicas, Prometheus and Grafana run in namespace heart, and /health and /predict answer through the LoadBalancer (Figure 16). The interactive Swagger UI at /docs is shown in Figure 17; note that the x-request-id header matches the request_id in the body, so a response can be traced to its log line.</w:t>
+      </w:r>
+    </w:p>
+    <w:p>
+      <w:pPr>
+        <w:spacing w:after="40"/>
         <w:jc w:val="center"/>
       </w:pPr>
       <w:r>
-        <w:rPr>
-          <w:rFonts w:ascii="Calibri" w:cs="Calibri" w:eastAsia="Calibri" w:hAnsi="Calibri"/>
-          <w:b/>
-          <w:bCs/>
-          <w:color w:val="7A5C00"/>
-          <w:sz w:val="20"/>
-          <w:szCs w:val="20"/>
-        </w:rPr>
-        <w:t xml:space="preserve">[INSERT SCREENSHOT: screenshots/08_k8s_pods_svc.png]  </w:t>
-      </w:r>
-      <w:r>
-        <w:rPr>
-          <w:rFonts w:ascii="Calibri" w:cs="Calibri" w:eastAsia="Calibri" w:hAnsi="Calibri"/>
-          <w:color w:val="7A5C00"/>
-          <w:sz w:val="20"/>
-          <w:szCs w:val="20"/>
-        </w:rPr>
-        <w:t xml:space="preserve">pods Running and the LoadBalancer EXTERNAL-IP</w:t>
-      </w:r>
-    </w:p>
-    <w:p>
-      <w:pPr>
-        <w:pBdr>
-          <w:top w:val="dashed" w:color="C9A227" w:sz="6"/>
-          <w:bottom w:val="dashed" w:color="C9A227" w:sz="6"/>
-          <w:left w:val="dashed" w:color="C9A227" w:sz="6"/>
-          <w:right w:val="dashed" w:color="C9A227" w:sz="6"/>
-        </w:pBdr>
-        <w:shd w:fill="FFF4CC" w:val="clear"/>
-        <w:spacing w:after="200" w:before="120"/>
+        <w:drawing>
+          <wp:inline distT="0" distB="0" distL="0" distR="0">
+            <wp:extent cx="5334000" cy="2524125"/>
+            <wp:effectExtent t="0" r="0" b="0" l="0"/>
+            <wp:docPr id="1" name="" descr="" title=""/>
+            <wp:cNvGraphicFramePr>
+              <a:graphicFrameLocks xmlns:a="http://schemas.openxmlformats.org/drawingml/2006/main" noChangeAspect="1"/>
+            </wp:cNvGraphicFramePr>
+            <a:graphic xmlns:a="http://schemas.openxmlformats.org/drawingml/2006/main">
+              <a:graphicData uri="http://schemas.openxmlformats.org/drawingml/2006/picture">
+                <pic:pic xmlns:pic="http://schemas.openxmlformats.org/drawingml/2006/picture">
+                  <pic:nvPicPr>
+                    <pic:cNvPr id="0" name="" descr=""/>
+                    <pic:cNvPicPr>
+                      <a:picLocks noChangeAspect="1" noChangeArrowheads="1"/>
+                    </pic:cNvPicPr>
+                  </pic:nvPicPr>
+                  <pic:blipFill>
+                    <a:blip r:embed="rId23" cstate="none"/>
+                    <a:srcRect/>
+                    <a:stretch>
+                      <a:fillRect/>
+                    </a:stretch>
+                  </pic:blipFill>
+                  <pic:spPr bwMode="auto">
+                    <a:xfrm>
+                      <a:off x="0" y="0"/>
+                      <a:ext cx="5334000" cy="2524125"/>
+                    </a:xfrm>
+                    <a:prstGeom prst="rect">
+                      <a:avLst/>
+                    </a:prstGeom>
+                  </pic:spPr>
+                </pic:pic>
+              </a:graphicData>
+            </a:graphic>
+          </wp:inline>
+        </w:drawing>
+      </w:r>
+    </w:p>
+    <w:p>
+      <w:pPr>
+        <w:spacing w:after="160"/>
         <w:jc w:val="center"/>
       </w:pPr>
       <w:r>
         <w:rPr>
           <w:rFonts w:ascii="Calibri" w:cs="Calibri" w:eastAsia="Calibri" w:hAnsi="Calibri"/>
-          <w:b/>
-          <w:bCs/>
-          <w:color w:val="7A5C00"/>
-          <w:sz w:val="20"/>
-          <w:szCs w:val="20"/>
-        </w:rPr>
-        <w:t xml:space="preserve">[INSERT SCREENSHOT: screenshots/09_k8s_predict.png]  </w:t>
-      </w:r>
-      <w:r>
-        <w:rPr>
-          <w:rFonts w:ascii="Calibri" w:cs="Calibri" w:eastAsia="Calibri" w:hAnsi="Calibri"/>
-          <w:color w:val="7A5C00"/>
-          <w:sz w:val="20"/>
-          <w:szCs w:val="20"/>
-        </w:rPr>
-        <w:t xml:space="preserve">prediction returned through the LoadBalancer / Ingress</w:t>
-      </w:r>
-    </w:p>
-    <w:p>
-      <w:pPr>
-        <w:pBdr>
-          <w:top w:val="dashed" w:color="C9A227" w:sz="6"/>
-          <w:bottom w:val="dashed" w:color="C9A227" w:sz="6"/>
-          <w:left w:val="dashed" w:color="C9A227" w:sz="6"/>
-          <w:right w:val="dashed" w:color="C9A227" w:sz="6"/>
-        </w:pBdr>
-        <w:shd w:fill="FFF4CC" w:val="clear"/>
-        <w:spacing w:after="200" w:before="120"/>
+          <w:i/>
+          <w:iCs/>
+          <w:color w:val="555555"/>
+          <w:sz w:val="18"/>
+          <w:szCs w:val="18"/>
+        </w:rPr>
+        <w:t xml:space="preserve">Figure 16. Pods, services (LoadBalancer with external IP) and predictions through the LoadBalancer</w:t>
+      </w:r>
+    </w:p>
+    <w:p>
+      <w:pPr>
+        <w:spacing w:after="40"/>
         <w:jc w:val="center"/>
       </w:pPr>
       <w:r>
-        <w:rPr>
-          <w:rFonts w:ascii="Calibri" w:cs="Calibri" w:eastAsia="Calibri" w:hAnsi="Calibri"/>
-          <w:b/>
-          <w:bCs/>
-          <w:color w:val="7A5C00"/>
-          <w:sz w:val="20"/>
-          <w:szCs w:val="20"/>
-        </w:rPr>
-        <w:t xml:space="preserve">[INSERT SCREENSHOT: screenshots/10_swagger_ui.png]  </w:t>
-      </w:r>
-      <w:r>
-        <w:rPr>
-          <w:rFonts w:ascii="Calibri" w:cs="Calibri" w:eastAsia="Calibri" w:hAnsi="Calibri"/>
-          <w:color w:val="7A5C00"/>
-          <w:sz w:val="20"/>
-          <w:szCs w:val="20"/>
-        </w:rPr>
-        <w:t xml:space="preserve">Swagger UI /docs with an executed /predict call</w:t>
+        <w:drawing>
+          <wp:inline distT="0" distB="0" distL="0" distR="0">
+            <wp:extent cx="4476750" cy="2590800"/>
+            <wp:effectExtent t="0" r="0" b="0" l="0"/>
+            <wp:docPr id="1" name="" descr="" title=""/>
+            <wp:cNvGraphicFramePr>
+              <a:graphicFrameLocks xmlns:a="http://schemas.openxmlformats.org/drawingml/2006/main" noChangeAspect="1"/>
+            </wp:cNvGraphicFramePr>
+            <a:graphic xmlns:a="http://schemas.openxmlformats.org/drawingml/2006/main">
+              <a:graphicData uri="http://schemas.openxmlformats.org/drawingml/2006/picture">
+                <pic:pic xmlns:pic="http://schemas.openxmlformats.org/drawingml/2006/picture">
+                  <pic:nvPicPr>
+                    <pic:cNvPr id="0" name="" descr=""/>
+                    <pic:cNvPicPr>
+                      <a:picLocks noChangeAspect="1" noChangeArrowheads="1"/>
+                    </pic:cNvPicPr>
+                  </pic:nvPicPr>
+                  <pic:blipFill>
+                    <a:blip r:embed="rId24" cstate="none"/>
+                    <a:srcRect/>
+                    <a:stretch>
+                      <a:fillRect/>
+                    </a:stretch>
+                  </pic:blipFill>
+                  <pic:spPr bwMode="auto">
+                    <a:xfrm>
+                      <a:off x="0" y="0"/>
+                      <a:ext cx="4476750" cy="2590800"/>
+                    </a:xfrm>
+                    <a:prstGeom prst="rect">
+                      <a:avLst/>
+                    </a:prstGeom>
+                  </pic:spPr>
+                </pic:pic>
+              </a:graphicData>
+            </a:graphic>
+          </wp:inline>
+        </w:drawing>
+      </w:r>
+    </w:p>
+    <w:p>
+      <w:pPr>
+        <w:spacing w:after="160"/>
+        <w:jc w:val="center"/>
+      </w:pPr>
+      <w:r>
+        <w:rPr>
+          <w:rFonts w:ascii="Calibri" w:cs="Calibri" w:eastAsia="Calibri" w:hAnsi="Calibri"/>
+          <w:i/>
+          <w:iCs/>
+          <w:color w:val="555555"/>
+          <w:sz w:val="18"/>
+          <w:szCs w:val="18"/>
+        </w:rPr>
+        <w:t xml:space="preserve">Figure 17. Swagger UI: POST /predict with HTTP 200 response</w:t>
       </w:r>
     </w:p>
     <w:p>
@@ -5141,101 +6205,204 @@
     </w:p>
     <w:p>
       <w:pPr>
-        <w:pBdr>
-          <w:top w:val="dashed" w:color="C9A227" w:sz="6"/>
-          <w:bottom w:val="dashed" w:color="C9A227" w:sz="6"/>
-          <w:left w:val="dashed" w:color="C9A227" w:sz="6"/>
-          <w:right w:val="dashed" w:color="C9A227" w:sz="6"/>
-        </w:pBdr>
-        <w:shd w:fill="FFF4CC" w:val="clear"/>
-        <w:spacing w:after="200" w:before="120"/>
+        <w:spacing w:after="120" w:line="276"/>
+      </w:pPr>
+      <w:r>
+        <w:rPr>
+          <w:rFonts w:ascii="Calibri" w:cs="Calibri" w:eastAsia="Calibri" w:hAnsi="Calibri"/>
+          <w:sz w:val="22"/>
+          <w:szCs w:val="22"/>
+        </w:rPr>
+        <w:t xml:space="preserve">Prometheus found both API pods automatically and scrapes each one separately (2/2 up, Figure 18), so counters are never mixed when the LoadBalancer spreads traffic. A load test of 1,500 requests, 5% of them deliberately invalid, produced the dashboard in Figure 19: 1,425 predictions, an error rate of 4.6% (the invalid requests, all rejected with HTTP 422) and a p95 latency of about 38 ms. The probability-distribution panel shows Prometheus histogram buckets, which are cumulative (each value counts predictions at or below that probability).</w:t>
+      </w:r>
+    </w:p>
+    <w:p>
+      <w:pPr>
+        <w:spacing w:after="40"/>
         <w:jc w:val="center"/>
       </w:pPr>
       <w:r>
-        <w:rPr>
-          <w:rFonts w:ascii="Calibri" w:cs="Calibri" w:eastAsia="Calibri" w:hAnsi="Calibri"/>
-          <w:b/>
-          <w:bCs/>
-          <w:color w:val="7A5C00"/>
-          <w:sz w:val="20"/>
-          <w:szCs w:val="20"/>
-        </w:rPr>
-        <w:t xml:space="preserve">[INSERT SCREENSHOT: screenshots/11_grafana_dashboard.png]  </w:t>
-      </w:r>
-      <w:r>
-        <w:rPr>
-          <w:rFonts w:ascii="Calibri" w:cs="Calibri" w:eastAsia="Calibri" w:hAnsi="Calibri"/>
-          <w:color w:val="7A5C00"/>
-          <w:sz w:val="20"/>
-          <w:szCs w:val="20"/>
-        </w:rPr>
-        <w:t xml:space="preserve">Grafana dashboard after the load test</w:t>
-      </w:r>
-    </w:p>
-    <w:p>
-      <w:pPr>
-        <w:pBdr>
-          <w:top w:val="dashed" w:color="C9A227" w:sz="6"/>
-          <w:bottom w:val="dashed" w:color="C9A227" w:sz="6"/>
-          <w:left w:val="dashed" w:color="C9A227" w:sz="6"/>
-          <w:right w:val="dashed" w:color="C9A227" w:sz="6"/>
-        </w:pBdr>
-        <w:shd w:fill="FFF4CC" w:val="clear"/>
-        <w:spacing w:after="200" w:before="120"/>
+        <w:drawing>
+          <wp:inline distT="0" distB="0" distL="0" distR="0">
+            <wp:extent cx="5334000" cy="1562100"/>
+            <wp:effectExtent t="0" r="0" b="0" l="0"/>
+            <wp:docPr id="1" name="" descr="" title=""/>
+            <wp:cNvGraphicFramePr>
+              <a:graphicFrameLocks xmlns:a="http://schemas.openxmlformats.org/drawingml/2006/main" noChangeAspect="1"/>
+            </wp:cNvGraphicFramePr>
+            <a:graphic xmlns:a="http://schemas.openxmlformats.org/drawingml/2006/main">
+              <a:graphicData uri="http://schemas.openxmlformats.org/drawingml/2006/picture">
+                <pic:pic xmlns:pic="http://schemas.openxmlformats.org/drawingml/2006/picture">
+                  <pic:nvPicPr>
+                    <pic:cNvPr id="0" name="" descr=""/>
+                    <pic:cNvPicPr>
+                      <a:picLocks noChangeAspect="1" noChangeArrowheads="1"/>
+                    </pic:cNvPicPr>
+                  </pic:nvPicPr>
+                  <pic:blipFill>
+                    <a:blip r:embed="rId25" cstate="none"/>
+                    <a:srcRect/>
+                    <a:stretch>
+                      <a:fillRect/>
+                    </a:stretch>
+                  </pic:blipFill>
+                  <pic:spPr bwMode="auto">
+                    <a:xfrm>
+                      <a:off x="0" y="0"/>
+                      <a:ext cx="5334000" cy="1562100"/>
+                    </a:xfrm>
+                    <a:prstGeom prst="rect">
+                      <a:avLst/>
+                    </a:prstGeom>
+                  </pic:spPr>
+                </pic:pic>
+              </a:graphicData>
+            </a:graphic>
+          </wp:inline>
+        </w:drawing>
+      </w:r>
+    </w:p>
+    <w:p>
+      <w:pPr>
+        <w:spacing w:after="160"/>
         <w:jc w:val="center"/>
       </w:pPr>
       <w:r>
         <w:rPr>
           <w:rFonts w:ascii="Calibri" w:cs="Calibri" w:eastAsia="Calibri" w:hAnsi="Calibri"/>
-          <w:b/>
-          <w:bCs/>
-          <w:color w:val="7A5C00"/>
-          <w:sz w:val="20"/>
-          <w:szCs w:val="20"/>
-        </w:rPr>
-        <w:t xml:space="preserve">[INSERT SCREENSHOT: screenshots/12_prometheus_targets.png]  </w:t>
-      </w:r>
-      <w:r>
-        <w:rPr>
-          <w:rFonts w:ascii="Calibri" w:cs="Calibri" w:eastAsia="Calibri" w:hAnsi="Calibri"/>
-          <w:color w:val="7A5C00"/>
-          <w:sz w:val="20"/>
-          <w:szCs w:val="20"/>
-        </w:rPr>
-        <w:t xml:space="preserve">Prometheus targets showing API pods UP</w:t>
-      </w:r>
-    </w:p>
-    <w:p>
-      <w:pPr>
-        <w:pBdr>
-          <w:top w:val="dashed" w:color="C9A227" w:sz="6"/>
-          <w:bottom w:val="dashed" w:color="C9A227" w:sz="6"/>
-          <w:left w:val="dashed" w:color="C9A227" w:sz="6"/>
-          <w:right w:val="dashed" w:color="C9A227" w:sz="6"/>
-        </w:pBdr>
-        <w:shd w:fill="FFF4CC" w:val="clear"/>
-        <w:spacing w:after="200" w:before="120"/>
+          <w:i/>
+          <w:iCs/>
+          <w:color w:val="555555"/>
+          <w:sz w:val="18"/>
+          <w:szCs w:val="18"/>
+        </w:rPr>
+        <w:t xml:space="preserve">Figure 18. Prometheus targets: both heart-api pods discovered and UP</w:t>
+      </w:r>
+    </w:p>
+    <w:p>
+      <w:pPr>
+        <w:spacing w:after="40"/>
         <w:jc w:val="center"/>
       </w:pPr>
       <w:r>
-        <w:rPr>
-          <w:rFonts w:ascii="Calibri" w:cs="Calibri" w:eastAsia="Calibri" w:hAnsi="Calibri"/>
-          <w:b/>
-          <w:bCs/>
-          <w:color w:val="7A5C00"/>
-          <w:sz w:val="20"/>
-          <w:szCs w:val="20"/>
-        </w:rPr>
-        <w:t xml:space="preserve">[INSERT SCREENSHOT: screenshots/13_api_logs.png]  </w:t>
-      </w:r>
-      <w:r>
-        <w:rPr>
-          <w:rFonts w:ascii="Calibri" w:cs="Calibri" w:eastAsia="Calibri" w:hAnsi="Calibri"/>
-          <w:color w:val="7A5C00"/>
-          <w:sz w:val="20"/>
-          <w:szCs w:val="20"/>
-        </w:rPr>
-        <w:t xml:space="preserve">JSON request logs from kubectl logs</w:t>
+        <w:drawing>
+          <wp:inline distT="0" distB="0" distL="0" distR="0">
+            <wp:extent cx="5334000" cy="2762250"/>
+            <wp:effectExtent t="0" r="0" b="0" l="0"/>
+            <wp:docPr id="1" name="" descr="" title=""/>
+            <wp:cNvGraphicFramePr>
+              <a:graphicFrameLocks xmlns:a="http://schemas.openxmlformats.org/drawingml/2006/main" noChangeAspect="1"/>
+            </wp:cNvGraphicFramePr>
+            <a:graphic xmlns:a="http://schemas.openxmlformats.org/drawingml/2006/main">
+              <a:graphicData uri="http://schemas.openxmlformats.org/drawingml/2006/picture">
+                <pic:pic xmlns:pic="http://schemas.openxmlformats.org/drawingml/2006/picture">
+                  <pic:nvPicPr>
+                    <pic:cNvPr id="0" name="" descr=""/>
+                    <pic:cNvPicPr>
+                      <a:picLocks noChangeAspect="1" noChangeArrowheads="1"/>
+                    </pic:cNvPicPr>
+                  </pic:nvPicPr>
+                  <pic:blipFill>
+                    <a:blip r:embed="rId26" cstate="none"/>
+                    <a:srcRect/>
+                    <a:stretch>
+                      <a:fillRect/>
+                    </a:stretch>
+                  </pic:blipFill>
+                  <pic:spPr bwMode="auto">
+                    <a:xfrm>
+                      <a:off x="0" y="0"/>
+                      <a:ext cx="5334000" cy="2762250"/>
+                    </a:xfrm>
+                    <a:prstGeom prst="rect">
+                      <a:avLst/>
+                    </a:prstGeom>
+                  </pic:spPr>
+                </pic:pic>
+              </a:graphicData>
+            </a:graphic>
+          </wp:inline>
+        </w:drawing>
+      </w:r>
+    </w:p>
+    <w:p>
+      <w:pPr>
+        <w:spacing w:after="160"/>
+        <w:jc w:val="center"/>
+      </w:pPr>
+      <w:r>
+        <w:rPr>
+          <w:rFonts w:ascii="Calibri" w:cs="Calibri" w:eastAsia="Calibri" w:hAnsi="Calibri"/>
+          <w:i/>
+          <w:iCs/>
+          <w:color w:val="555555"/>
+          <w:sz w:val="18"/>
+          <w:szCs w:val="18"/>
+        </w:rPr>
+        <w:t xml:space="preserve">Figure 19. Grafana dashboard during the load test</w:t>
+      </w:r>
+    </w:p>
+    <w:p>
+      <w:pPr>
+        <w:spacing w:after="40"/>
+        <w:jc w:val="center"/>
+      </w:pPr>
+      <w:r>
+        <w:drawing>
+          <wp:inline distT="0" distB="0" distL="0" distR="0">
+            <wp:extent cx="5334000" cy="2057400"/>
+            <wp:effectExtent t="0" r="0" b="0" l="0"/>
+            <wp:docPr id="1" name="" descr="" title=""/>
+            <wp:cNvGraphicFramePr>
+              <a:graphicFrameLocks xmlns:a="http://schemas.openxmlformats.org/drawingml/2006/main" noChangeAspect="1"/>
+            </wp:cNvGraphicFramePr>
+            <a:graphic xmlns:a="http://schemas.openxmlformats.org/drawingml/2006/main">
+              <a:graphicData uri="http://schemas.openxmlformats.org/drawingml/2006/picture">
+                <pic:pic xmlns:pic="http://schemas.openxmlformats.org/drawingml/2006/picture">
+                  <pic:nvPicPr>
+                    <pic:cNvPr id="0" name="" descr=""/>
+                    <pic:cNvPicPr>
+                      <a:picLocks noChangeAspect="1" noChangeArrowheads="1"/>
+                    </pic:cNvPicPr>
+                  </pic:nvPicPr>
+                  <pic:blipFill>
+                    <a:blip r:embed="rId27" cstate="none"/>
+                    <a:srcRect/>
+                    <a:stretch>
+                      <a:fillRect/>
+                    </a:stretch>
+                  </pic:blipFill>
+                  <pic:spPr bwMode="auto">
+                    <a:xfrm>
+                      <a:off x="0" y="0"/>
+                      <a:ext cx="5334000" cy="2057400"/>
+                    </a:xfrm>
+                    <a:prstGeom prst="rect">
+                      <a:avLst/>
+                    </a:prstGeom>
+                  </pic:spPr>
+                </pic:pic>
+              </a:graphicData>
+            </a:graphic>
+          </wp:inline>
+        </w:drawing>
+      </w:r>
+    </w:p>
+    <w:p>
+      <w:pPr>
+        <w:spacing w:after="160"/>
+        <w:jc w:val="center"/>
+      </w:pPr>
+      <w:r>
+        <w:rPr>
+          <w:rFonts w:ascii="Calibri" w:cs="Calibri" w:eastAsia="Calibri" w:hAnsi="Calibri"/>
+          <w:i/>
+          <w:iCs/>
+          <w:color w:val="555555"/>
+          <w:sz w:val="18"/>
+          <w:szCs w:val="18"/>
+        </w:rPr>
+        <w:t xml:space="preserve">Figure 20. Structured JSON request logs from both pods (kubectl logs)</w:t>
       </w:r>
     </w:p>
     <w:p>
@@ -5343,7 +6510,7 @@
           <w:sz w:val="22"/>
           <w:szCs w:val="22"/>
         </w:rPr>
-        <w:t xml:space="preserve">Code repository: https://github.com/&lt;your-user&gt;/heart-mlops</w:t>
+        <w:t xml:space="preserve">Code repository: https://github.com/2025ae05835/heart-mlops</w:t>
       </w:r>
     </w:p>
     <w:p>
@@ -5361,7 +6528,7 @@
           <w:sz w:val="22"/>
           <w:szCs w:val="22"/>
         </w:rPr>
-        <w:t xml:space="preserve">Container image: ghcr.io/&lt;your-user&gt;/heart-api:latest</w:t>
+        <w:t xml:space="preserve">Container image: ghcr.io/2025ae05835/heart-api:latest</w:t>
       </w:r>
     </w:p>
     <w:p>
@@ -5379,7 +6546,7 @@
           <w:sz w:val="22"/>
           <w:szCs w:val="22"/>
         </w:rPr>
-        <w:t xml:space="preserve">API access: see Section 8 (Minikube LoadBalancer / Ingress)</w:t>
+        <w:t xml:space="preserve">API access: local Minikube; run scripts/deploy_k8s.sh and minikube tunnel, then call http://&lt;EXTERNAL-IP&gt;/predict (Section 8)</w:t>
       </w:r>
     </w:p>
     <w:p>
@@ -5397,7 +6564,7 @@
           <w:sz w:val="22"/>
           <w:szCs w:val="22"/>
         </w:rPr>
-        <w:t xml:space="preserve">Video walkthrough: [link]</w:t>
+        <w:t xml:space="preserve">Video walkthrough: https://github.com/2025ae05835/heart-mlops/blob/main/video/2025ae05835.mp4</w:t>
       </w:r>
     </w:p>
     <w:sectPr>

</xml_diff>